<commit_message>
docs: integrate final thesis report and correct experimental statistics
</commit_message>
<xml_diff>
--- a/Documents/Fragments/Capitulo 4 - Diseño experimental.docx
+++ b/Documents/Fragments/Capitulo 4 - Diseño experimental.docx
@@ -12,7 +12,7 @@
     </w:p>
     <w:p>
       <w:r>
-        <w:t>Este capítulo evalúa experimentalmente el sistema de detección de objetos AssistiveVision mediante tres preguntas encadenadas: (a) qué posición de montaje del teléfono produce las mejores detecciones (escenario 1); (b) cuál combinación de posición y lente funciona mejor (escenario 2); y (c) en qué rango de distancia entre el objeto y la cámara las detecciones siguen siendo confiables (escenario 3). Los tres escenarios comparten el mismo conjunto de fotografías, el mismo modelo y la misma instrumentación software, de modo que las diferencias observadas puedan atribuirse al factor manipulado en cada escenario.</w:t>
+        <w:t>Este capítulo evalúa experimentalmente el sistema de detección de objetos AssistiveVision mediante tres preguntas encadenadas: (a) qué posición de montaje del teléfono produce las mejores detecciones (escenario 1); (b) cuál combinación de posición y lente funciona mejor (escenario 2); y (c) en qué bandas de distancia geométricamente estimada cambia el recall (escenario 3). Los tres escenarios comparten el mismo conjunto de fotografías, el mismo modelo y la misma instrumentación software. El emparejamiento facilita comparar configuraciones, sin aislar todas las causas en cada escenario.</w:t>
       </w:r>
     </w:p>
     <w:p>
@@ -51,7 +51,7 @@
     </w:p>
     <w:p>
       <w:r>
-        <w:t>El sistema bajo prueba es la aplicación Android ejercida por una prueba de instrumentación que invoca los módulos de producción del prototipo (preprocesamiento, detección y mapeo inverso de coordenadas). El modelo seleccionado es EfficientDet-Lite2 en 448 × 448 píxeles; las imágenes verticales se redimensionan a 336 × 448 con relleno gris 114. Se retienen detecciones desde una puntuación mínima de 0,001 con un máximo de 15 por fotograma (valores de producción), y la operación se evalúa con un umbral de confianza de 0,30 y emparejamiento voraz uno a uno con IoU ≥ 0,50 y coincidencia de clase. El orden de las imágenes se baraja con la semilla 20261013 después de tres pasadas de calentamiento. La ejecución se verificó completa sobre las 198 fotografías; el entorno de ejecución y sus consecuencias se discuten en la sección 4.6.</w:t>
+        <w:t>El sistema bajo prueba es la aplicación Android ejercida por una prueba de instrumentación que invoca los módulos de producción del prototipo (preprocesamiento, detección y mapeo inverso de coordenadas). El modelo seleccionado es EfficientDet-Lite2 en 448 × 448 píxeles; las imágenes verticales se redimensionan a 336 × 448 con relleno gris 114. Se retienen detecciones desde una puntuación mínima de 0,001 para evaluar AP, con el límite de producción de 15 por fotograma; la operación se evalúa con un umbral de confianza de 0,30 y emparejamiento voraz uno a uno con IoU ≥ 0,50 y coincidencia de clase. El orden de las imágenes se baraja con la semilla 20261013 después de tres pasadas de calentamiento. La ejecución se verificó completa sobre las 198 fotografías; el entorno de ejecución y sus consecuencias se discuten en la sección 4.6.</w:t>
       </w:r>
     </w:p>
     <w:p>
@@ -96,10 +96,10 @@
         </w:tblBorders>
       </w:tblPr>
       <w:tblGrid>
-        <w:gridCol w:w="2088"/>
-        <w:gridCol w:w="2520"/>
-        <w:gridCol w:w="1512"/>
-        <w:gridCol w:w="2376"/>
+        <w:gridCol w:w="2219"/>
+        <w:gridCol w:w="2678"/>
+        <w:gridCol w:w="1607"/>
+        <w:gridCol w:w="2525"/>
       </w:tblGrid>
       <w:tr>
         <w:trPr>
@@ -108,7 +108,7 @@
         </w:trPr>
         <w:tc>
           <w:tcPr>
-            <w:tcW w:type="dxa" w:w="2257"/>
+            <w:tcW w:type="dxa" w:w="2219"/>
             <w:vAlign w:val="center"/>
           </w:tcPr>
           <w:p>
@@ -128,7 +128,7 @@
         </w:tc>
         <w:tc>
           <w:tcPr>
-            <w:tcW w:type="dxa" w:w="2257"/>
+            <w:tcW w:type="dxa" w:w="2678"/>
             <w:vAlign w:val="center"/>
           </w:tcPr>
           <w:p>
@@ -148,7 +148,7 @@
         </w:tc>
         <w:tc>
           <w:tcPr>
-            <w:tcW w:type="dxa" w:w="2257"/>
+            <w:tcW w:type="dxa" w:w="1607"/>
             <w:vAlign w:val="center"/>
           </w:tcPr>
           <w:p>
@@ -168,7 +168,7 @@
         </w:tc>
         <w:tc>
           <w:tcPr>
-            <w:tcW w:type="dxa" w:w="2257"/>
+            <w:tcW w:type="dxa" w:w="2525"/>
             <w:vAlign w:val="center"/>
           </w:tcPr>
           <w:p>
@@ -193,7 +193,7 @@
         </w:trPr>
         <w:tc>
           <w:tcPr>
-            <w:tcW w:type="dxa" w:w="2088"/>
+            <w:tcW w:type="dxa" w:w="2219"/>
             <w:vAlign w:val="center"/>
           </w:tcPr>
           <w:p>
@@ -213,7 +213,7 @@
         </w:tc>
         <w:tc>
           <w:tcPr>
-            <w:tcW w:type="dxa" w:w="2520"/>
+            <w:tcW w:type="dxa" w:w="2678"/>
             <w:vAlign w:val="center"/>
           </w:tcPr>
           <w:p>
@@ -233,7 +233,7 @@
         </w:tc>
         <w:tc>
           <w:tcPr>
-            <w:tcW w:type="dxa" w:w="1512"/>
+            <w:tcW w:type="dxa" w:w="1607"/>
             <w:vAlign w:val="center"/>
           </w:tcPr>
           <w:p>
@@ -253,7 +253,7 @@
         </w:tc>
         <w:tc>
           <w:tcPr>
-            <w:tcW w:type="dxa" w:w="2376"/>
+            <w:tcW w:type="dxa" w:w="2525"/>
             <w:vAlign w:val="center"/>
           </w:tcPr>
           <w:p>
@@ -278,7 +278,7 @@
         </w:trPr>
         <w:tc>
           <w:tcPr>
-            <w:tcW w:type="dxa" w:w="2088"/>
+            <w:tcW w:type="dxa" w:w="2219"/>
             <w:vAlign w:val="center"/>
           </w:tcPr>
           <w:p>
@@ -298,7 +298,7 @@
         </w:tc>
         <w:tc>
           <w:tcPr>
-            <w:tcW w:type="dxa" w:w="2520"/>
+            <w:tcW w:type="dxa" w:w="2678"/>
             <w:vAlign w:val="center"/>
           </w:tcPr>
           <w:p>
@@ -318,7 +318,7 @@
         </w:tc>
         <w:tc>
           <w:tcPr>
-            <w:tcW w:type="dxa" w:w="1512"/>
+            <w:tcW w:type="dxa" w:w="1607"/>
             <w:vAlign w:val="center"/>
           </w:tcPr>
           <w:p>
@@ -338,7 +338,7 @@
         </w:tc>
         <w:tc>
           <w:tcPr>
-            <w:tcW w:type="dxa" w:w="2376"/>
+            <w:tcW w:type="dxa" w:w="2525"/>
             <w:vAlign w:val="center"/>
           </w:tcPr>
           <w:p>
@@ -363,7 +363,7 @@
         </w:trPr>
         <w:tc>
           <w:tcPr>
-            <w:tcW w:type="dxa" w:w="2088"/>
+            <w:tcW w:type="dxa" w:w="2219"/>
             <w:vAlign w:val="center"/>
           </w:tcPr>
           <w:p>
@@ -383,7 +383,7 @@
         </w:tc>
         <w:tc>
           <w:tcPr>
-            <w:tcW w:type="dxa" w:w="2520"/>
+            <w:tcW w:type="dxa" w:w="2678"/>
             <w:vAlign w:val="center"/>
           </w:tcPr>
           <w:p>
@@ -403,7 +403,7 @@
         </w:tc>
         <w:tc>
           <w:tcPr>
-            <w:tcW w:type="dxa" w:w="1512"/>
+            <w:tcW w:type="dxa" w:w="1607"/>
             <w:vAlign w:val="center"/>
           </w:tcPr>
           <w:p>
@@ -423,7 +423,7 @@
         </w:tc>
         <w:tc>
           <w:tcPr>
-            <w:tcW w:type="dxa" w:w="2376"/>
+            <w:tcW w:type="dxa" w:w="2525"/>
             <w:vAlign w:val="center"/>
           </w:tcPr>
           <w:p>
@@ -473,17 +473,17 @@
         </w:tblBorders>
       </w:tblPr>
       <w:tblGrid>
-        <w:gridCol w:w="1656"/>
-        <w:gridCol w:w="648"/>
-        <w:gridCol w:w="893"/>
-        <w:gridCol w:w="936"/>
-        <w:gridCol w:w="720"/>
-        <w:gridCol w:w="1152"/>
-        <w:gridCol w:w="979"/>
-        <w:gridCol w:w="792"/>
-        <w:gridCol w:w="720"/>
-        <w:gridCol w:w="1296"/>
-        <w:gridCol w:w="1296"/>
+        <w:gridCol w:w="1348"/>
+        <w:gridCol w:w="528"/>
+        <w:gridCol w:w="727"/>
+        <w:gridCol w:w="762"/>
+        <w:gridCol w:w="586"/>
+        <w:gridCol w:w="938"/>
+        <w:gridCol w:w="797"/>
+        <w:gridCol w:w="645"/>
+        <w:gridCol w:w="586"/>
+        <w:gridCol w:w="1055"/>
+        <w:gridCol w:w="1055"/>
       </w:tblGrid>
       <w:tr>
         <w:trPr>
@@ -492,7 +492,7 @@
         </w:trPr>
         <w:tc>
           <w:tcPr>
-            <w:tcW w:type="dxa" w:w="821"/>
+            <w:tcW w:type="dxa" w:w="1348"/>
             <w:vAlign w:val="center"/>
           </w:tcPr>
           <w:p>
@@ -512,7 +512,7 @@
         </w:tc>
         <w:tc>
           <w:tcPr>
-            <w:tcW w:type="dxa" w:w="821"/>
+            <w:tcW w:type="dxa" w:w="528"/>
             <w:vAlign w:val="center"/>
           </w:tcPr>
           <w:p>
@@ -532,7 +532,7 @@
         </w:tc>
         <w:tc>
           <w:tcPr>
-            <w:tcW w:type="dxa" w:w="821"/>
+            <w:tcW w:type="dxa" w:w="727"/>
             <w:vAlign w:val="center"/>
           </w:tcPr>
           <w:p>
@@ -552,7 +552,7 @@
         </w:tc>
         <w:tc>
           <w:tcPr>
-            <w:tcW w:type="dxa" w:w="821"/>
+            <w:tcW w:type="dxa" w:w="762"/>
             <w:vAlign w:val="center"/>
           </w:tcPr>
           <w:p>
@@ -572,7 +572,7 @@
         </w:tc>
         <w:tc>
           <w:tcPr>
-            <w:tcW w:type="dxa" w:w="821"/>
+            <w:tcW w:type="dxa" w:w="586"/>
             <w:vAlign w:val="center"/>
           </w:tcPr>
           <w:p>
@@ -592,7 +592,7 @@
         </w:tc>
         <w:tc>
           <w:tcPr>
-            <w:tcW w:type="dxa" w:w="821"/>
+            <w:tcW w:type="dxa" w:w="938"/>
             <w:vAlign w:val="center"/>
           </w:tcPr>
           <w:p>
@@ -612,7 +612,7 @@
         </w:tc>
         <w:tc>
           <w:tcPr>
-            <w:tcW w:type="dxa" w:w="821"/>
+            <w:tcW w:type="dxa" w:w="797"/>
             <w:vAlign w:val="center"/>
           </w:tcPr>
           <w:p>
@@ -632,7 +632,7 @@
         </w:tc>
         <w:tc>
           <w:tcPr>
-            <w:tcW w:type="dxa" w:w="821"/>
+            <w:tcW w:type="dxa" w:w="645"/>
             <w:vAlign w:val="center"/>
           </w:tcPr>
           <w:p>
@@ -652,7 +652,7 @@
         </w:tc>
         <w:tc>
           <w:tcPr>
-            <w:tcW w:type="dxa" w:w="821"/>
+            <w:tcW w:type="dxa" w:w="586"/>
             <w:vAlign w:val="center"/>
           </w:tcPr>
           <w:p>
@@ -672,7 +672,7 @@
         </w:tc>
         <w:tc>
           <w:tcPr>
-            <w:tcW w:type="dxa" w:w="821"/>
+            <w:tcW w:type="dxa" w:w="1055"/>
             <w:vAlign w:val="center"/>
           </w:tcPr>
           <w:p>
@@ -692,7 +692,7 @@
         </w:tc>
         <w:tc>
           <w:tcPr>
-            <w:tcW w:type="dxa" w:w="821"/>
+            <w:tcW w:type="dxa" w:w="1055"/>
             <w:vAlign w:val="center"/>
           </w:tcPr>
           <w:p>
@@ -717,7 +717,7 @@
         </w:trPr>
         <w:tc>
           <w:tcPr>
-            <w:tcW w:type="dxa" w:w="1656"/>
+            <w:tcW w:type="dxa" w:w="1348"/>
             <w:vAlign w:val="center"/>
           </w:tcPr>
           <w:p>
@@ -737,7 +737,7 @@
         </w:tc>
         <w:tc>
           <w:tcPr>
-            <w:tcW w:type="dxa" w:w="648"/>
+            <w:tcW w:type="dxa" w:w="528"/>
             <w:vAlign w:val="center"/>
           </w:tcPr>
           <w:p>
@@ -757,7 +757,7 @@
         </w:tc>
         <w:tc>
           <w:tcPr>
-            <w:tcW w:type="dxa" w:w="893"/>
+            <w:tcW w:type="dxa" w:w="727"/>
             <w:vAlign w:val="center"/>
           </w:tcPr>
           <w:p>
@@ -777,7 +777,7 @@
         </w:tc>
         <w:tc>
           <w:tcPr>
-            <w:tcW w:type="dxa" w:w="936"/>
+            <w:tcW w:type="dxa" w:w="762"/>
             <w:vAlign w:val="center"/>
           </w:tcPr>
           <w:p>
@@ -797,7 +797,7 @@
         </w:tc>
         <w:tc>
           <w:tcPr>
-            <w:tcW w:type="dxa" w:w="720"/>
+            <w:tcW w:type="dxa" w:w="586"/>
             <w:vAlign w:val="center"/>
           </w:tcPr>
           <w:p>
@@ -817,7 +817,7 @@
         </w:tc>
         <w:tc>
           <w:tcPr>
-            <w:tcW w:type="dxa" w:w="1152"/>
+            <w:tcW w:type="dxa" w:w="938"/>
             <w:vAlign w:val="center"/>
           </w:tcPr>
           <w:p>
@@ -837,7 +837,7 @@
         </w:tc>
         <w:tc>
           <w:tcPr>
-            <w:tcW w:type="dxa" w:w="979"/>
+            <w:tcW w:type="dxa" w:w="797"/>
             <w:vAlign w:val="center"/>
           </w:tcPr>
           <w:p>
@@ -857,7 +857,7 @@
         </w:tc>
         <w:tc>
           <w:tcPr>
-            <w:tcW w:type="dxa" w:w="792"/>
+            <w:tcW w:type="dxa" w:w="645"/>
             <w:vAlign w:val="center"/>
           </w:tcPr>
           <w:p>
@@ -877,7 +877,7 @@
         </w:tc>
         <w:tc>
           <w:tcPr>
-            <w:tcW w:type="dxa" w:w="720"/>
+            <w:tcW w:type="dxa" w:w="586"/>
             <w:vAlign w:val="center"/>
           </w:tcPr>
           <w:p>
@@ -897,7 +897,7 @@
         </w:tc>
         <w:tc>
           <w:tcPr>
-            <w:tcW w:type="dxa" w:w="1296"/>
+            <w:tcW w:type="dxa" w:w="1055"/>
             <w:vAlign w:val="center"/>
           </w:tcPr>
           <w:p>
@@ -917,7 +917,7 @@
         </w:tc>
         <w:tc>
           <w:tcPr>
-            <w:tcW w:type="dxa" w:w="1296"/>
+            <w:tcW w:type="dxa" w:w="1055"/>
             <w:vAlign w:val="center"/>
           </w:tcPr>
           <w:p>
@@ -942,7 +942,7 @@
         </w:trPr>
         <w:tc>
           <w:tcPr>
-            <w:tcW w:type="dxa" w:w="1656"/>
+            <w:tcW w:type="dxa" w:w="1348"/>
             <w:vAlign w:val="center"/>
           </w:tcPr>
           <w:p>
@@ -962,7 +962,7 @@
         </w:tc>
         <w:tc>
           <w:tcPr>
-            <w:tcW w:type="dxa" w:w="648"/>
+            <w:tcW w:type="dxa" w:w="528"/>
             <w:vAlign w:val="center"/>
           </w:tcPr>
           <w:p>
@@ -982,7 +982,7 @@
         </w:tc>
         <w:tc>
           <w:tcPr>
-            <w:tcW w:type="dxa" w:w="893"/>
+            <w:tcW w:type="dxa" w:w="727"/>
             <w:vAlign w:val="center"/>
           </w:tcPr>
           <w:p>
@@ -1002,7 +1002,7 @@
         </w:tc>
         <w:tc>
           <w:tcPr>
-            <w:tcW w:type="dxa" w:w="936"/>
+            <w:tcW w:type="dxa" w:w="762"/>
             <w:vAlign w:val="center"/>
           </w:tcPr>
           <w:p>
@@ -1022,7 +1022,7 @@
         </w:tc>
         <w:tc>
           <w:tcPr>
-            <w:tcW w:type="dxa" w:w="720"/>
+            <w:tcW w:type="dxa" w:w="586"/>
             <w:vAlign w:val="center"/>
           </w:tcPr>
           <w:p>
@@ -1042,7 +1042,7 @@
         </w:tc>
         <w:tc>
           <w:tcPr>
-            <w:tcW w:type="dxa" w:w="1152"/>
+            <w:tcW w:type="dxa" w:w="938"/>
             <w:vAlign w:val="center"/>
           </w:tcPr>
           <w:p>
@@ -1062,7 +1062,7 @@
         </w:tc>
         <w:tc>
           <w:tcPr>
-            <w:tcW w:type="dxa" w:w="979"/>
+            <w:tcW w:type="dxa" w:w="797"/>
             <w:vAlign w:val="center"/>
           </w:tcPr>
           <w:p>
@@ -1082,7 +1082,7 @@
         </w:tc>
         <w:tc>
           <w:tcPr>
-            <w:tcW w:type="dxa" w:w="792"/>
+            <w:tcW w:type="dxa" w:w="645"/>
             <w:vAlign w:val="center"/>
           </w:tcPr>
           <w:p>
@@ -1102,7 +1102,7 @@
         </w:tc>
         <w:tc>
           <w:tcPr>
-            <w:tcW w:type="dxa" w:w="720"/>
+            <w:tcW w:type="dxa" w:w="586"/>
             <w:vAlign w:val="center"/>
           </w:tcPr>
           <w:p>
@@ -1122,7 +1122,7 @@
         </w:tc>
         <w:tc>
           <w:tcPr>
-            <w:tcW w:type="dxa" w:w="1296"/>
+            <w:tcW w:type="dxa" w:w="1055"/>
             <w:vAlign w:val="center"/>
           </w:tcPr>
           <w:p>
@@ -1142,7 +1142,7 @@
         </w:tc>
         <w:tc>
           <w:tcPr>
-            <w:tcW w:type="dxa" w:w="1296"/>
+            <w:tcW w:type="dxa" w:w="1055"/>
             <w:vAlign w:val="center"/>
           </w:tcPr>
           <w:p>
@@ -1167,7 +1167,7 @@
         </w:trPr>
         <w:tc>
           <w:tcPr>
-            <w:tcW w:type="dxa" w:w="1656"/>
+            <w:tcW w:type="dxa" w:w="1348"/>
             <w:vAlign w:val="center"/>
           </w:tcPr>
           <w:p>
@@ -1187,7 +1187,7 @@
         </w:tc>
         <w:tc>
           <w:tcPr>
-            <w:tcW w:type="dxa" w:w="648"/>
+            <w:tcW w:type="dxa" w:w="528"/>
             <w:vAlign w:val="center"/>
           </w:tcPr>
           <w:p>
@@ -1207,7 +1207,7 @@
         </w:tc>
         <w:tc>
           <w:tcPr>
-            <w:tcW w:type="dxa" w:w="893"/>
+            <w:tcW w:type="dxa" w:w="727"/>
             <w:vAlign w:val="center"/>
           </w:tcPr>
           <w:p>
@@ -1227,7 +1227,7 @@
         </w:tc>
         <w:tc>
           <w:tcPr>
-            <w:tcW w:type="dxa" w:w="936"/>
+            <w:tcW w:type="dxa" w:w="762"/>
             <w:vAlign w:val="center"/>
           </w:tcPr>
           <w:p>
@@ -1247,7 +1247,7 @@
         </w:tc>
         <w:tc>
           <w:tcPr>
-            <w:tcW w:type="dxa" w:w="720"/>
+            <w:tcW w:type="dxa" w:w="586"/>
             <w:vAlign w:val="center"/>
           </w:tcPr>
           <w:p>
@@ -1267,7 +1267,7 @@
         </w:tc>
         <w:tc>
           <w:tcPr>
-            <w:tcW w:type="dxa" w:w="1152"/>
+            <w:tcW w:type="dxa" w:w="938"/>
             <w:vAlign w:val="center"/>
           </w:tcPr>
           <w:p>
@@ -1287,7 +1287,7 @@
         </w:tc>
         <w:tc>
           <w:tcPr>
-            <w:tcW w:type="dxa" w:w="979"/>
+            <w:tcW w:type="dxa" w:w="797"/>
             <w:vAlign w:val="center"/>
           </w:tcPr>
           <w:p>
@@ -1307,7 +1307,7 @@
         </w:tc>
         <w:tc>
           <w:tcPr>
-            <w:tcW w:type="dxa" w:w="792"/>
+            <w:tcW w:type="dxa" w:w="645"/>
             <w:vAlign w:val="center"/>
           </w:tcPr>
           <w:p>
@@ -1327,7 +1327,7 @@
         </w:tc>
         <w:tc>
           <w:tcPr>
-            <w:tcW w:type="dxa" w:w="720"/>
+            <w:tcW w:type="dxa" w:w="586"/>
             <w:vAlign w:val="center"/>
           </w:tcPr>
           <w:p>
@@ -1347,7 +1347,7 @@
         </w:tc>
         <w:tc>
           <w:tcPr>
-            <w:tcW w:type="dxa" w:w="1296"/>
+            <w:tcW w:type="dxa" w:w="1055"/>
             <w:vAlign w:val="center"/>
           </w:tcPr>
           <w:p>
@@ -1367,7 +1367,7 @@
         </w:tc>
         <w:tc>
           <w:tcPr>
-            <w:tcW w:type="dxa" w:w="1296"/>
+            <w:tcW w:type="dxa" w:w="1055"/>
             <w:vAlign w:val="center"/>
           </w:tcPr>
           <w:p>
@@ -1422,12 +1422,12 @@
         </w:tblBorders>
       </w:tblPr>
       <w:tblGrid>
-        <w:gridCol w:w="1584"/>
-        <w:gridCol w:w="1800"/>
-        <w:gridCol w:w="2520"/>
-        <w:gridCol w:w="792"/>
-        <w:gridCol w:w="648"/>
-        <w:gridCol w:w="1224"/>
+        <w:gridCol w:w="1669"/>
+        <w:gridCol w:w="1897"/>
+        <w:gridCol w:w="2656"/>
+        <w:gridCol w:w="835"/>
+        <w:gridCol w:w="683"/>
+        <w:gridCol w:w="1290"/>
       </w:tblGrid>
       <w:tr>
         <w:trPr>
@@ -1436,7 +1436,7 @@
         </w:trPr>
         <w:tc>
           <w:tcPr>
-            <w:tcW w:type="dxa" w:w="1505"/>
+            <w:tcW w:type="dxa" w:w="1669"/>
             <w:vAlign w:val="center"/>
           </w:tcPr>
           <w:p>
@@ -1456,7 +1456,7 @@
         </w:tc>
         <w:tc>
           <w:tcPr>
-            <w:tcW w:type="dxa" w:w="1505"/>
+            <w:tcW w:type="dxa" w:w="1897"/>
             <w:vAlign w:val="center"/>
           </w:tcPr>
           <w:p>
@@ -1476,7 +1476,7 @@
         </w:tc>
         <w:tc>
           <w:tcPr>
-            <w:tcW w:type="dxa" w:w="1505"/>
+            <w:tcW w:type="dxa" w:w="2656"/>
             <w:vAlign w:val="center"/>
           </w:tcPr>
           <w:p>
@@ -1496,7 +1496,7 @@
         </w:tc>
         <w:tc>
           <w:tcPr>
-            <w:tcW w:type="dxa" w:w="1505"/>
+            <w:tcW w:type="dxa" w:w="835"/>
             <w:vAlign w:val="center"/>
           </w:tcPr>
           <w:p>
@@ -1516,7 +1516,7 @@
         </w:tc>
         <w:tc>
           <w:tcPr>
-            <w:tcW w:type="dxa" w:w="1505"/>
+            <w:tcW w:type="dxa" w:w="683"/>
             <w:vAlign w:val="center"/>
           </w:tcPr>
           <w:p>
@@ -1536,7 +1536,7 @@
         </w:tc>
         <w:tc>
           <w:tcPr>
-            <w:tcW w:type="dxa" w:w="1505"/>
+            <w:tcW w:type="dxa" w:w="1290"/>
             <w:vAlign w:val="center"/>
           </w:tcPr>
           <w:p>
@@ -1561,7 +1561,7 @@
         </w:trPr>
         <w:tc>
           <w:tcPr>
-            <w:tcW w:type="dxa" w:w="1584"/>
+            <w:tcW w:type="dxa" w:w="1669"/>
             <w:vAlign w:val="center"/>
           </w:tcPr>
           <w:p>
@@ -1581,7 +1581,7 @@
         </w:tc>
         <w:tc>
           <w:tcPr>
-            <w:tcW w:type="dxa" w:w="1800"/>
+            <w:tcW w:type="dxa" w:w="1897"/>
             <w:vAlign w:val="center"/>
           </w:tcPr>
           <w:p>
@@ -1601,7 +1601,7 @@
         </w:tc>
         <w:tc>
           <w:tcPr>
-            <w:tcW w:type="dxa" w:w="2520"/>
+            <w:tcW w:type="dxa" w:w="2656"/>
             <w:vAlign w:val="center"/>
           </w:tcPr>
           <w:p>
@@ -1621,7 +1621,7 @@
         </w:tc>
         <w:tc>
           <w:tcPr>
-            <w:tcW w:type="dxa" w:w="792"/>
+            <w:tcW w:type="dxa" w:w="835"/>
             <w:vAlign w:val="center"/>
           </w:tcPr>
           <w:p>
@@ -1641,7 +1641,7 @@
         </w:tc>
         <w:tc>
           <w:tcPr>
-            <w:tcW w:type="dxa" w:w="648"/>
+            <w:tcW w:type="dxa" w:w="683"/>
             <w:vAlign w:val="center"/>
           </w:tcPr>
           <w:p>
@@ -1661,7 +1661,7 @@
         </w:tc>
         <w:tc>
           <w:tcPr>
-            <w:tcW w:type="dxa" w:w="1224"/>
+            <w:tcW w:type="dxa" w:w="1290"/>
             <w:vAlign w:val="center"/>
           </w:tcPr>
           <w:p>
@@ -1675,7 +1675,7 @@
                 <w:color w:val="000000"/>
                 <w:sz w:val="20"/>
               </w:rPr>
-              <w:t>0,1075</w:t>
+              <w:t>0,1468</w:t>
             </w:r>
           </w:p>
         </w:tc>
@@ -1686,7 +1686,7 @@
         </w:trPr>
         <w:tc>
           <w:tcPr>
-            <w:tcW w:type="dxa" w:w="1584"/>
+            <w:tcW w:type="dxa" w:w="1669"/>
             <w:vAlign w:val="center"/>
           </w:tcPr>
           <w:p>
@@ -1706,7 +1706,7 @@
         </w:tc>
         <w:tc>
           <w:tcPr>
-            <w:tcW w:type="dxa" w:w="1800"/>
+            <w:tcW w:type="dxa" w:w="1897"/>
             <w:vAlign w:val="center"/>
           </w:tcPr>
           <w:p>
@@ -1726,7 +1726,7 @@
         </w:tc>
         <w:tc>
           <w:tcPr>
-            <w:tcW w:type="dxa" w:w="2520"/>
+            <w:tcW w:type="dxa" w:w="2656"/>
             <w:vAlign w:val="center"/>
           </w:tcPr>
           <w:p>
@@ -1746,7 +1746,7 @@
         </w:tc>
         <w:tc>
           <w:tcPr>
-            <w:tcW w:type="dxa" w:w="792"/>
+            <w:tcW w:type="dxa" w:w="835"/>
             <w:vAlign w:val="center"/>
           </w:tcPr>
           <w:p>
@@ -1766,7 +1766,7 @@
         </w:tc>
         <w:tc>
           <w:tcPr>
-            <w:tcW w:type="dxa" w:w="648"/>
+            <w:tcW w:type="dxa" w:w="683"/>
             <w:vAlign w:val="center"/>
           </w:tcPr>
           <w:p>
@@ -1786,7 +1786,7 @@
         </w:tc>
         <w:tc>
           <w:tcPr>
-            <w:tcW w:type="dxa" w:w="1224"/>
+            <w:tcW w:type="dxa" w:w="1290"/>
             <w:vAlign w:val="center"/>
           </w:tcPr>
           <w:p>
@@ -1811,7 +1811,7 @@
         </w:trPr>
         <w:tc>
           <w:tcPr>
-            <w:tcW w:type="dxa" w:w="1584"/>
+            <w:tcW w:type="dxa" w:w="1669"/>
             <w:vAlign w:val="center"/>
           </w:tcPr>
           <w:p>
@@ -1831,7 +1831,7 @@
         </w:tc>
         <w:tc>
           <w:tcPr>
-            <w:tcW w:type="dxa" w:w="1800"/>
+            <w:tcW w:type="dxa" w:w="1897"/>
             <w:vAlign w:val="center"/>
           </w:tcPr>
           <w:p>
@@ -1851,7 +1851,7 @@
         </w:tc>
         <w:tc>
           <w:tcPr>
-            <w:tcW w:type="dxa" w:w="2520"/>
+            <w:tcW w:type="dxa" w:w="2656"/>
             <w:vAlign w:val="center"/>
           </w:tcPr>
           <w:p>
@@ -1871,7 +1871,7 @@
         </w:tc>
         <w:tc>
           <w:tcPr>
-            <w:tcW w:type="dxa" w:w="792"/>
+            <w:tcW w:type="dxa" w:w="835"/>
             <w:vAlign w:val="center"/>
           </w:tcPr>
           <w:p>
@@ -1891,7 +1891,7 @@
         </w:tc>
         <w:tc>
           <w:tcPr>
-            <w:tcW w:type="dxa" w:w="648"/>
+            <w:tcW w:type="dxa" w:w="683"/>
             <w:vAlign w:val="center"/>
           </w:tcPr>
           <w:p>
@@ -1911,7 +1911,7 @@
         </w:tc>
         <w:tc>
           <w:tcPr>
-            <w:tcW w:type="dxa" w:w="1224"/>
+            <w:tcW w:type="dxa" w:w="1290"/>
             <w:vAlign w:val="center"/>
           </w:tcPr>
           <w:p>
@@ -1925,7 +1925,7 @@
                 <w:color w:val="000000"/>
                 <w:sz w:val="20"/>
               </w:rPr>
-              <w:t>0,0365</w:t>
+              <w:t>0,1130</w:t>
             </w:r>
           </w:p>
         </w:tc>
@@ -1942,7 +1942,7 @@
     </w:p>
     <w:p>
       <w:r>
-        <w:t>El Gorillapod supera significativamente a la cabeza (t(32) = -3,71, p = 0,0008) y, con margen más estrecho, también al pecho (t(32) = -1,63, p = 0,0365); la diferencia entre cabeza y pecho no es significativa (t(32) = -1,49, p = 0,1075). En conjunto: la vista de cabeza queda descartada por cobertura; entre pecho y Gorillapod el mayor número de objetos del Gorillapod convive con un margen relativamente estrecho (0,455 objetos/escena), lo que anticipa el análisis por configuración de la sección 4.3. La figura siguiente muestra la dispersión de los conteos.</w:t>
+        <w:t>El Gorillapod supera significativamente a la cabeza (t(32) = -3,71, p = 0,0008). Frente al pecho, la diferencia no alcanza el umbral exploratorio de 0,05 (t(32) = -1,63, p = 0,1130); la diferencia entre cabeza y pecho no es significativa (t(32) = -1,49, p = 0,1468). En conjunto: la vista de cabeza ofrece menor cobertura en este conjunto; entre pecho y Gorillapod el mayor número de objetos del Gorillapod convive con un margen relativamente estrecho (0,455 objetos/escena), lo que anticipa el análisis por configuración de la sección 4.3. La figura siguiente muestra la dispersión de los conteos.</w:t>
       </w:r>
     </w:p>
     <w:p>
@@ -2026,13 +2026,13 @@
         </w:tblBorders>
       </w:tblPr>
       <w:tblGrid>
-        <w:gridCol w:w="1901"/>
-        <w:gridCol w:w="893"/>
-        <w:gridCol w:w="936"/>
-        <w:gridCol w:w="792"/>
-        <w:gridCol w:w="864"/>
-        <w:gridCol w:w="1512"/>
-        <w:gridCol w:w="1267"/>
+        <w:gridCol w:w="2102"/>
+        <w:gridCol w:w="987"/>
+        <w:gridCol w:w="1035"/>
+        <w:gridCol w:w="876"/>
+        <w:gridCol w:w="955"/>
+        <w:gridCol w:w="1672"/>
+        <w:gridCol w:w="1401"/>
       </w:tblGrid>
       <w:tr>
         <w:trPr>
@@ -2041,7 +2041,7 @@
         </w:trPr>
         <w:tc>
           <w:tcPr>
-            <w:tcW w:type="dxa" w:w="1290"/>
+            <w:tcW w:type="dxa" w:w="2102"/>
             <w:vAlign w:val="center"/>
           </w:tcPr>
           <w:p>
@@ -2061,7 +2061,7 @@
         </w:tc>
         <w:tc>
           <w:tcPr>
-            <w:tcW w:type="dxa" w:w="1290"/>
+            <w:tcW w:type="dxa" w:w="987"/>
             <w:vAlign w:val="center"/>
           </w:tcPr>
           <w:p>
@@ -2081,7 +2081,7 @@
         </w:tc>
         <w:tc>
           <w:tcPr>
-            <w:tcW w:type="dxa" w:w="1290"/>
+            <w:tcW w:type="dxa" w:w="1035"/>
             <w:vAlign w:val="center"/>
           </w:tcPr>
           <w:p>
@@ -2101,7 +2101,7 @@
         </w:tc>
         <w:tc>
           <w:tcPr>
-            <w:tcW w:type="dxa" w:w="1290"/>
+            <w:tcW w:type="dxa" w:w="876"/>
             <w:vAlign w:val="center"/>
           </w:tcPr>
           <w:p>
@@ -2121,7 +2121,7 @@
         </w:tc>
         <w:tc>
           <w:tcPr>
-            <w:tcW w:type="dxa" w:w="1290"/>
+            <w:tcW w:type="dxa" w:w="955"/>
             <w:vAlign w:val="center"/>
           </w:tcPr>
           <w:p>
@@ -2141,7 +2141,7 @@
         </w:tc>
         <w:tc>
           <w:tcPr>
-            <w:tcW w:type="dxa" w:w="1290"/>
+            <w:tcW w:type="dxa" w:w="1672"/>
             <w:vAlign w:val="center"/>
           </w:tcPr>
           <w:p>
@@ -2161,7 +2161,7 @@
         </w:tc>
         <w:tc>
           <w:tcPr>
-            <w:tcW w:type="dxa" w:w="1290"/>
+            <w:tcW w:type="dxa" w:w="1401"/>
             <w:vAlign w:val="center"/>
           </w:tcPr>
           <w:p>
@@ -2186,7 +2186,7 @@
         </w:trPr>
         <w:tc>
           <w:tcPr>
-            <w:tcW w:type="dxa" w:w="1901"/>
+            <w:tcW w:type="dxa" w:w="2102"/>
             <w:vAlign w:val="center"/>
           </w:tcPr>
           <w:p>
@@ -2206,7 +2206,7 @@
         </w:tc>
         <w:tc>
           <w:tcPr>
-            <w:tcW w:type="dxa" w:w="893"/>
+            <w:tcW w:type="dxa" w:w="987"/>
             <w:vAlign w:val="center"/>
           </w:tcPr>
           <w:p>
@@ -2226,7 +2226,7 @@
         </w:tc>
         <w:tc>
           <w:tcPr>
-            <w:tcW w:type="dxa" w:w="936"/>
+            <w:tcW w:type="dxa" w:w="1035"/>
             <w:vAlign w:val="center"/>
           </w:tcPr>
           <w:p>
@@ -2246,7 +2246,7 @@
         </w:tc>
         <w:tc>
           <w:tcPr>
-            <w:tcW w:type="dxa" w:w="792"/>
+            <w:tcW w:type="dxa" w:w="876"/>
             <w:vAlign w:val="center"/>
           </w:tcPr>
           <w:p>
@@ -2266,7 +2266,7 @@
         </w:tc>
         <w:tc>
           <w:tcPr>
-            <w:tcW w:type="dxa" w:w="864"/>
+            <w:tcW w:type="dxa" w:w="955"/>
             <w:vAlign w:val="center"/>
           </w:tcPr>
           <w:p>
@@ -2286,7 +2286,7 @@
         </w:tc>
         <w:tc>
           <w:tcPr>
-            <w:tcW w:type="dxa" w:w="1512"/>
+            <w:tcW w:type="dxa" w:w="1672"/>
             <w:vAlign w:val="center"/>
           </w:tcPr>
           <w:p>
@@ -2306,7 +2306,7 @@
         </w:tc>
         <w:tc>
           <w:tcPr>
-            <w:tcW w:type="dxa" w:w="1267"/>
+            <w:tcW w:type="dxa" w:w="1401"/>
             <w:vAlign w:val="center"/>
           </w:tcPr>
           <w:p>
@@ -2331,7 +2331,7 @@
         </w:trPr>
         <w:tc>
           <w:tcPr>
-            <w:tcW w:type="dxa" w:w="1901"/>
+            <w:tcW w:type="dxa" w:w="2102"/>
             <w:vAlign w:val="center"/>
           </w:tcPr>
           <w:p>
@@ -2351,7 +2351,7 @@
         </w:tc>
         <w:tc>
           <w:tcPr>
-            <w:tcW w:type="dxa" w:w="893"/>
+            <w:tcW w:type="dxa" w:w="987"/>
             <w:vAlign w:val="center"/>
           </w:tcPr>
           <w:p>
@@ -2371,7 +2371,7 @@
         </w:tc>
         <w:tc>
           <w:tcPr>
-            <w:tcW w:type="dxa" w:w="936"/>
+            <w:tcW w:type="dxa" w:w="1035"/>
             <w:vAlign w:val="center"/>
           </w:tcPr>
           <w:p>
@@ -2391,7 +2391,7 @@
         </w:tc>
         <w:tc>
           <w:tcPr>
-            <w:tcW w:type="dxa" w:w="792"/>
+            <w:tcW w:type="dxa" w:w="876"/>
             <w:vAlign w:val="center"/>
           </w:tcPr>
           <w:p>
@@ -2411,7 +2411,7 @@
         </w:tc>
         <w:tc>
           <w:tcPr>
-            <w:tcW w:type="dxa" w:w="864"/>
+            <w:tcW w:type="dxa" w:w="955"/>
             <w:vAlign w:val="center"/>
           </w:tcPr>
           <w:p>
@@ -2431,7 +2431,7 @@
         </w:tc>
         <w:tc>
           <w:tcPr>
-            <w:tcW w:type="dxa" w:w="1512"/>
+            <w:tcW w:type="dxa" w:w="1672"/>
             <w:vAlign w:val="center"/>
           </w:tcPr>
           <w:p>
@@ -2451,7 +2451,7 @@
         </w:tc>
         <w:tc>
           <w:tcPr>
-            <w:tcW w:type="dxa" w:w="1267"/>
+            <w:tcW w:type="dxa" w:w="1401"/>
             <w:vAlign w:val="center"/>
           </w:tcPr>
           <w:p>
@@ -2476,7 +2476,7 @@
         </w:trPr>
         <w:tc>
           <w:tcPr>
-            <w:tcW w:type="dxa" w:w="1901"/>
+            <w:tcW w:type="dxa" w:w="2102"/>
             <w:vAlign w:val="center"/>
           </w:tcPr>
           <w:p>
@@ -2496,7 +2496,7 @@
         </w:tc>
         <w:tc>
           <w:tcPr>
-            <w:tcW w:type="dxa" w:w="893"/>
+            <w:tcW w:type="dxa" w:w="987"/>
             <w:vAlign w:val="center"/>
           </w:tcPr>
           <w:p>
@@ -2516,7 +2516,7 @@
         </w:tc>
         <w:tc>
           <w:tcPr>
-            <w:tcW w:type="dxa" w:w="936"/>
+            <w:tcW w:type="dxa" w:w="1035"/>
             <w:vAlign w:val="center"/>
           </w:tcPr>
           <w:p>
@@ -2536,7 +2536,7 @@
         </w:tc>
         <w:tc>
           <w:tcPr>
-            <w:tcW w:type="dxa" w:w="792"/>
+            <w:tcW w:type="dxa" w:w="876"/>
             <w:vAlign w:val="center"/>
           </w:tcPr>
           <w:p>
@@ -2556,7 +2556,7 @@
         </w:tc>
         <w:tc>
           <w:tcPr>
-            <w:tcW w:type="dxa" w:w="864"/>
+            <w:tcW w:type="dxa" w:w="955"/>
             <w:vAlign w:val="center"/>
           </w:tcPr>
           <w:p>
@@ -2576,7 +2576,7 @@
         </w:tc>
         <w:tc>
           <w:tcPr>
-            <w:tcW w:type="dxa" w:w="1512"/>
+            <w:tcW w:type="dxa" w:w="1672"/>
             <w:vAlign w:val="center"/>
           </w:tcPr>
           <w:p>
@@ -2596,7 +2596,7 @@
         </w:tc>
         <w:tc>
           <w:tcPr>
-            <w:tcW w:type="dxa" w:w="1267"/>
+            <w:tcW w:type="dxa" w:w="1401"/>
             <w:vAlign w:val="center"/>
           </w:tcPr>
           <w:p>
@@ -2621,7 +2621,7 @@
         </w:trPr>
         <w:tc>
           <w:tcPr>
-            <w:tcW w:type="dxa" w:w="1901"/>
+            <w:tcW w:type="dxa" w:w="2102"/>
             <w:vAlign w:val="center"/>
           </w:tcPr>
           <w:p>
@@ -2641,7 +2641,7 @@
         </w:tc>
         <w:tc>
           <w:tcPr>
-            <w:tcW w:type="dxa" w:w="893"/>
+            <w:tcW w:type="dxa" w:w="987"/>
             <w:vAlign w:val="center"/>
           </w:tcPr>
           <w:p>
@@ -2661,7 +2661,7 @@
         </w:tc>
         <w:tc>
           <w:tcPr>
-            <w:tcW w:type="dxa" w:w="936"/>
+            <w:tcW w:type="dxa" w:w="1035"/>
             <w:vAlign w:val="center"/>
           </w:tcPr>
           <w:p>
@@ -2681,7 +2681,7 @@
         </w:tc>
         <w:tc>
           <w:tcPr>
-            <w:tcW w:type="dxa" w:w="792"/>
+            <w:tcW w:type="dxa" w:w="876"/>
             <w:vAlign w:val="center"/>
           </w:tcPr>
           <w:p>
@@ -2701,7 +2701,7 @@
         </w:tc>
         <w:tc>
           <w:tcPr>
-            <w:tcW w:type="dxa" w:w="864"/>
+            <w:tcW w:type="dxa" w:w="955"/>
             <w:vAlign w:val="center"/>
           </w:tcPr>
           <w:p>
@@ -2721,7 +2721,7 @@
         </w:tc>
         <w:tc>
           <w:tcPr>
-            <w:tcW w:type="dxa" w:w="1512"/>
+            <w:tcW w:type="dxa" w:w="1672"/>
             <w:vAlign w:val="center"/>
           </w:tcPr>
           <w:p>
@@ -2741,7 +2741,7 @@
         </w:tc>
         <w:tc>
           <w:tcPr>
-            <w:tcW w:type="dxa" w:w="1267"/>
+            <w:tcW w:type="dxa" w:w="1401"/>
             <w:vAlign w:val="center"/>
           </w:tcPr>
           <w:p>
@@ -2766,7 +2766,7 @@
         </w:trPr>
         <w:tc>
           <w:tcPr>
-            <w:tcW w:type="dxa" w:w="1901"/>
+            <w:tcW w:type="dxa" w:w="2102"/>
             <w:vAlign w:val="center"/>
           </w:tcPr>
           <w:p>
@@ -2786,7 +2786,7 @@
         </w:tc>
         <w:tc>
           <w:tcPr>
-            <w:tcW w:type="dxa" w:w="893"/>
+            <w:tcW w:type="dxa" w:w="987"/>
             <w:vAlign w:val="center"/>
           </w:tcPr>
           <w:p>
@@ -2806,7 +2806,7 @@
         </w:tc>
         <w:tc>
           <w:tcPr>
-            <w:tcW w:type="dxa" w:w="936"/>
+            <w:tcW w:type="dxa" w:w="1035"/>
             <w:vAlign w:val="center"/>
           </w:tcPr>
           <w:p>
@@ -2826,7 +2826,7 @@
         </w:tc>
         <w:tc>
           <w:tcPr>
-            <w:tcW w:type="dxa" w:w="792"/>
+            <w:tcW w:type="dxa" w:w="876"/>
             <w:vAlign w:val="center"/>
           </w:tcPr>
           <w:p>
@@ -2846,7 +2846,7 @@
         </w:tc>
         <w:tc>
           <w:tcPr>
-            <w:tcW w:type="dxa" w:w="864"/>
+            <w:tcW w:type="dxa" w:w="955"/>
             <w:vAlign w:val="center"/>
           </w:tcPr>
           <w:p>
@@ -2866,7 +2866,7 @@
         </w:tc>
         <w:tc>
           <w:tcPr>
-            <w:tcW w:type="dxa" w:w="1512"/>
+            <w:tcW w:type="dxa" w:w="1672"/>
             <w:vAlign w:val="center"/>
           </w:tcPr>
           <w:p>
@@ -2886,7 +2886,7 @@
         </w:tc>
         <w:tc>
           <w:tcPr>
-            <w:tcW w:type="dxa" w:w="1267"/>
+            <w:tcW w:type="dxa" w:w="1401"/>
             <w:vAlign w:val="center"/>
           </w:tcPr>
           <w:p>
@@ -2911,7 +2911,7 @@
         </w:trPr>
         <w:tc>
           <w:tcPr>
-            <w:tcW w:type="dxa" w:w="1901"/>
+            <w:tcW w:type="dxa" w:w="2102"/>
             <w:vAlign w:val="center"/>
           </w:tcPr>
           <w:p>
@@ -2931,7 +2931,7 @@
         </w:tc>
         <w:tc>
           <w:tcPr>
-            <w:tcW w:type="dxa" w:w="893"/>
+            <w:tcW w:type="dxa" w:w="987"/>
             <w:vAlign w:val="center"/>
           </w:tcPr>
           <w:p>
@@ -2951,7 +2951,7 @@
         </w:tc>
         <w:tc>
           <w:tcPr>
-            <w:tcW w:type="dxa" w:w="936"/>
+            <w:tcW w:type="dxa" w:w="1035"/>
             <w:vAlign w:val="center"/>
           </w:tcPr>
           <w:p>
@@ -2971,7 +2971,7 @@
         </w:tc>
         <w:tc>
           <w:tcPr>
-            <w:tcW w:type="dxa" w:w="792"/>
+            <w:tcW w:type="dxa" w:w="876"/>
             <w:vAlign w:val="center"/>
           </w:tcPr>
           <w:p>
@@ -2991,7 +2991,7 @@
         </w:tc>
         <w:tc>
           <w:tcPr>
-            <w:tcW w:type="dxa" w:w="864"/>
+            <w:tcW w:type="dxa" w:w="955"/>
             <w:vAlign w:val="center"/>
           </w:tcPr>
           <w:p>
@@ -3011,7 +3011,7 @@
         </w:tc>
         <w:tc>
           <w:tcPr>
-            <w:tcW w:type="dxa" w:w="1512"/>
+            <w:tcW w:type="dxa" w:w="1672"/>
             <w:vAlign w:val="center"/>
           </w:tcPr>
           <w:p>
@@ -3031,7 +3031,7 @@
         </w:tc>
         <w:tc>
           <w:tcPr>
-            <w:tcW w:type="dxa" w:w="1267"/>
+            <w:tcW w:type="dxa" w:w="1401"/>
             <w:vAlign w:val="center"/>
           </w:tcPr>
           <w:p>
@@ -3057,7 +3057,7 @@
         <w:pStyle w:val="Caption"/>
       </w:pPr>
       <w:r>
-        <w:t>Correctas y falsas se contabilizan con confianza 0,30 e IoU ≥ 0,50 sobre las 33 fotografías por configuración; AP se calcula con el historial completo de puntuaciones del detector; "Correctas (lista)" aplica el límite de dos objetos por fotograma.</w:t>
+        <w:t>Correctas y falsas se contabilizan con confianza 0,30 e IoU ≥ 0,50 sobre las 33 fotografías por configuración; AP se calcula con las predicciones conservadas desde 0,001 y el límite de 15; "Correctas (lista)" aplica el límite de dos objetos por fotograma.</w:t>
       </w:r>
     </w:p>
     <w:p>
@@ -3067,7 +3067,7 @@
     </w:p>
     <w:p>
       <w:r>
-        <w:t>La comparación de lentes agrupando montajes tampoco es concluyente: F1 59,0% para 1x frente a 55,9% para 0,5x (diferencia pareada +3,1 puntos de F1, IC 95 % [-2,2; 8,9]). La vista amplia contiene 491 instancias visibles frente a 398 del 1x (+23,4 %) y recupera 229 correctas frente a 196 (+16,8 %): la ganancia en recuperación se paga con más falsas por fotograma y una F1 levemente menor.</w:t>
+        <w:t>La comparación de lentes agrupando montajes tampoco es concluyente: F1 59,0% para 1x frente a 55,9% para 0,5x (diferencia pareada +3,1 puntos de F1, IC 95 % [-2,2; 8,9]). La vista amplia contiene 491 instancias visibles frente a 398 del 1x (+23,4 %) y recupera 229 correctas frente a 196 (+16,8 %): la ganancia de conteo convive con más predicciones falsas por fotografía y menor F1.</w:t>
       </w:r>
     </w:p>
     <w:tbl>
@@ -3086,12 +3086,12 @@
         </w:tblBorders>
       </w:tblPr>
       <w:tblGrid>
-        <w:gridCol w:w="2045"/>
-        <w:gridCol w:w="1368"/>
-        <w:gridCol w:w="1440"/>
-        <w:gridCol w:w="1152"/>
-        <w:gridCol w:w="1512"/>
-        <w:gridCol w:w="1152"/>
+        <w:gridCol w:w="2130"/>
+        <w:gridCol w:w="1425"/>
+        <w:gridCol w:w="1500"/>
+        <w:gridCol w:w="1200"/>
+        <w:gridCol w:w="1575"/>
+        <w:gridCol w:w="1200"/>
       </w:tblGrid>
       <w:tr>
         <w:trPr>
@@ -3100,7 +3100,7 @@
         </w:trPr>
         <w:tc>
           <w:tcPr>
-            <w:tcW w:type="dxa" w:w="1505"/>
+            <w:tcW w:type="dxa" w:w="2130"/>
             <w:vAlign w:val="center"/>
           </w:tcPr>
           <w:p>
@@ -3120,7 +3120,7 @@
         </w:tc>
         <w:tc>
           <w:tcPr>
-            <w:tcW w:type="dxa" w:w="1505"/>
+            <w:tcW w:type="dxa" w:w="1425"/>
             <w:vAlign w:val="center"/>
           </w:tcPr>
           <w:p>
@@ -3140,7 +3140,7 @@
         </w:tc>
         <w:tc>
           <w:tcPr>
-            <w:tcW w:type="dxa" w:w="1505"/>
+            <w:tcW w:type="dxa" w:w="1500"/>
             <w:vAlign w:val="center"/>
           </w:tcPr>
           <w:p>
@@ -3160,7 +3160,7 @@
         </w:tc>
         <w:tc>
           <w:tcPr>
-            <w:tcW w:type="dxa" w:w="1505"/>
+            <w:tcW w:type="dxa" w:w="1200"/>
             <w:vAlign w:val="center"/>
           </w:tcPr>
           <w:p>
@@ -3180,7 +3180,7 @@
         </w:tc>
         <w:tc>
           <w:tcPr>
-            <w:tcW w:type="dxa" w:w="1505"/>
+            <w:tcW w:type="dxa" w:w="1575"/>
             <w:vAlign w:val="center"/>
           </w:tcPr>
           <w:p>
@@ -3200,7 +3200,7 @@
         </w:tc>
         <w:tc>
           <w:tcPr>
-            <w:tcW w:type="dxa" w:w="1505"/>
+            <w:tcW w:type="dxa" w:w="1200"/>
             <w:vAlign w:val="center"/>
           </w:tcPr>
           <w:p>
@@ -3225,7 +3225,7 @@
         </w:trPr>
         <w:tc>
           <w:tcPr>
-            <w:tcW w:type="dxa" w:w="2045"/>
+            <w:tcW w:type="dxa" w:w="2130"/>
             <w:vAlign w:val="center"/>
           </w:tcPr>
           <w:p>
@@ -3245,7 +3245,7 @@
         </w:tc>
         <w:tc>
           <w:tcPr>
-            <w:tcW w:type="dxa" w:w="1368"/>
+            <w:tcW w:type="dxa" w:w="1425"/>
             <w:vAlign w:val="center"/>
           </w:tcPr>
           <w:p>
@@ -3265,7 +3265,7 @@
         </w:tc>
         <w:tc>
           <w:tcPr>
-            <w:tcW w:type="dxa" w:w="1440"/>
+            <w:tcW w:type="dxa" w:w="1500"/>
             <w:vAlign w:val="center"/>
           </w:tcPr>
           <w:p>
@@ -3285,7 +3285,7 @@
         </w:tc>
         <w:tc>
           <w:tcPr>
-            <w:tcW w:type="dxa" w:w="1152"/>
+            <w:tcW w:type="dxa" w:w="1200"/>
             <w:vAlign w:val="center"/>
           </w:tcPr>
           <w:p>
@@ -3305,7 +3305,7 @@
         </w:tc>
         <w:tc>
           <w:tcPr>
-            <w:tcW w:type="dxa" w:w="1512"/>
+            <w:tcW w:type="dxa" w:w="1575"/>
             <w:vAlign w:val="center"/>
           </w:tcPr>
           <w:p>
@@ -3325,7 +3325,7 @@
         </w:tc>
         <w:tc>
           <w:tcPr>
-            <w:tcW w:type="dxa" w:w="1152"/>
+            <w:tcW w:type="dxa" w:w="1200"/>
             <w:vAlign w:val="center"/>
           </w:tcPr>
           <w:p>
@@ -3350,7 +3350,7 @@
         </w:trPr>
         <w:tc>
           <w:tcPr>
-            <w:tcW w:type="dxa" w:w="2045"/>
+            <w:tcW w:type="dxa" w:w="2130"/>
             <w:vAlign w:val="center"/>
           </w:tcPr>
           <w:p>
@@ -3370,7 +3370,7 @@
         </w:tc>
         <w:tc>
           <w:tcPr>
-            <w:tcW w:type="dxa" w:w="1368"/>
+            <w:tcW w:type="dxa" w:w="1425"/>
             <w:vAlign w:val="center"/>
           </w:tcPr>
           <w:p>
@@ -3390,7 +3390,7 @@
         </w:tc>
         <w:tc>
           <w:tcPr>
-            <w:tcW w:type="dxa" w:w="1440"/>
+            <w:tcW w:type="dxa" w:w="1500"/>
             <w:vAlign w:val="center"/>
           </w:tcPr>
           <w:p>
@@ -3410,7 +3410,7 @@
         </w:tc>
         <w:tc>
           <w:tcPr>
-            <w:tcW w:type="dxa" w:w="1152"/>
+            <w:tcW w:type="dxa" w:w="1200"/>
             <w:vAlign w:val="center"/>
           </w:tcPr>
           <w:p>
@@ -3430,7 +3430,7 @@
         </w:tc>
         <w:tc>
           <w:tcPr>
-            <w:tcW w:type="dxa" w:w="1512"/>
+            <w:tcW w:type="dxa" w:w="1575"/>
             <w:vAlign w:val="center"/>
           </w:tcPr>
           <w:p>
@@ -3450,7 +3450,7 @@
         </w:tc>
         <w:tc>
           <w:tcPr>
-            <w:tcW w:type="dxa" w:w="1152"/>
+            <w:tcW w:type="dxa" w:w="1200"/>
             <w:vAlign w:val="center"/>
           </w:tcPr>
           <w:p>
@@ -3464,7 +3464,7 @@
                 <w:color w:val="000000"/>
                 <w:sz w:val="20"/>
               </w:rPr>
-              <w:t>0,0261</w:t>
+              <w:t>0,0260</w:t>
             </w:r>
           </w:p>
         </w:tc>
@@ -3475,7 +3475,7 @@
         </w:trPr>
         <w:tc>
           <w:tcPr>
-            <w:tcW w:type="dxa" w:w="2045"/>
+            <w:tcW w:type="dxa" w:w="2130"/>
             <w:vAlign w:val="center"/>
           </w:tcPr>
           <w:p>
@@ -3495,7 +3495,7 @@
         </w:tc>
         <w:tc>
           <w:tcPr>
-            <w:tcW w:type="dxa" w:w="1368"/>
+            <w:tcW w:type="dxa" w:w="1425"/>
             <w:vAlign w:val="center"/>
           </w:tcPr>
           <w:p>
@@ -3515,7 +3515,7 @@
         </w:tc>
         <w:tc>
           <w:tcPr>
-            <w:tcW w:type="dxa" w:w="1440"/>
+            <w:tcW w:type="dxa" w:w="1500"/>
             <w:vAlign w:val="center"/>
           </w:tcPr>
           <w:p>
@@ -3535,7 +3535,7 @@
         </w:tc>
         <w:tc>
           <w:tcPr>
-            <w:tcW w:type="dxa" w:w="1152"/>
+            <w:tcW w:type="dxa" w:w="1200"/>
             <w:vAlign w:val="center"/>
           </w:tcPr>
           <w:p>
@@ -3555,7 +3555,7 @@
         </w:tc>
         <w:tc>
           <w:tcPr>
-            <w:tcW w:type="dxa" w:w="1512"/>
+            <w:tcW w:type="dxa" w:w="1575"/>
             <w:vAlign w:val="center"/>
           </w:tcPr>
           <w:p>
@@ -3575,7 +3575,7 @@
         </w:tc>
         <w:tc>
           <w:tcPr>
-            <w:tcW w:type="dxa" w:w="1152"/>
+            <w:tcW w:type="dxa" w:w="1200"/>
             <w:vAlign w:val="center"/>
           </w:tcPr>
           <w:p>
@@ -3600,7 +3600,7 @@
         </w:trPr>
         <w:tc>
           <w:tcPr>
-            <w:tcW w:type="dxa" w:w="2045"/>
+            <w:tcW w:type="dxa" w:w="2130"/>
             <w:vAlign w:val="center"/>
           </w:tcPr>
           <w:p>
@@ -3620,7 +3620,7 @@
         </w:tc>
         <w:tc>
           <w:tcPr>
-            <w:tcW w:type="dxa" w:w="1368"/>
+            <w:tcW w:type="dxa" w:w="1425"/>
             <w:vAlign w:val="center"/>
           </w:tcPr>
           <w:p>
@@ -3640,7 +3640,7 @@
         </w:tc>
         <w:tc>
           <w:tcPr>
-            <w:tcW w:type="dxa" w:w="1440"/>
+            <w:tcW w:type="dxa" w:w="1500"/>
             <w:vAlign w:val="center"/>
           </w:tcPr>
           <w:p>
@@ -3660,7 +3660,7 @@
         </w:tc>
         <w:tc>
           <w:tcPr>
-            <w:tcW w:type="dxa" w:w="1152"/>
+            <w:tcW w:type="dxa" w:w="1200"/>
             <w:vAlign w:val="center"/>
           </w:tcPr>
           <w:p>
@@ -3680,7 +3680,7 @@
         </w:tc>
         <w:tc>
           <w:tcPr>
-            <w:tcW w:type="dxa" w:w="1512"/>
+            <w:tcW w:type="dxa" w:w="1575"/>
             <w:vAlign w:val="center"/>
           </w:tcPr>
           <w:p>
@@ -3700,7 +3700,7 @@
         </w:tc>
         <w:tc>
           <w:tcPr>
-            <w:tcW w:type="dxa" w:w="1152"/>
+            <w:tcW w:type="dxa" w:w="1200"/>
             <w:vAlign w:val="center"/>
           </w:tcPr>
           <w:p>
@@ -3714,7 +3714,7 @@
                 <w:color w:val="000000"/>
                 <w:sz w:val="20"/>
               </w:rPr>
-              <w:t>0,4056</w:t>
+              <w:t>0,4064</w:t>
             </w:r>
           </w:p>
         </w:tc>
@@ -3725,7 +3725,7 @@
         </w:trPr>
         <w:tc>
           <w:tcPr>
-            <w:tcW w:type="dxa" w:w="2045"/>
+            <w:tcW w:type="dxa" w:w="2130"/>
             <w:vAlign w:val="center"/>
           </w:tcPr>
           <w:p>
@@ -3745,7 +3745,7 @@
         </w:tc>
         <w:tc>
           <w:tcPr>
-            <w:tcW w:type="dxa" w:w="1368"/>
+            <w:tcW w:type="dxa" w:w="1425"/>
             <w:vAlign w:val="center"/>
           </w:tcPr>
           <w:p>
@@ -3765,7 +3765,7 @@
         </w:tc>
         <w:tc>
           <w:tcPr>
-            <w:tcW w:type="dxa" w:w="1440"/>
+            <w:tcW w:type="dxa" w:w="1500"/>
             <w:vAlign w:val="center"/>
           </w:tcPr>
           <w:p>
@@ -3785,7 +3785,7 @@
         </w:tc>
         <w:tc>
           <w:tcPr>
-            <w:tcW w:type="dxa" w:w="1152"/>
+            <w:tcW w:type="dxa" w:w="1200"/>
             <w:vAlign w:val="center"/>
           </w:tcPr>
           <w:p>
@@ -3805,7 +3805,7 @@
         </w:tc>
         <w:tc>
           <w:tcPr>
-            <w:tcW w:type="dxa" w:w="1512"/>
+            <w:tcW w:type="dxa" w:w="1575"/>
             <w:vAlign w:val="center"/>
           </w:tcPr>
           <w:p>
@@ -3825,7 +3825,7 @@
         </w:tc>
         <w:tc>
           <w:tcPr>
-            <w:tcW w:type="dxa" w:w="1152"/>
+            <w:tcW w:type="dxa" w:w="1200"/>
             <w:vAlign w:val="center"/>
           </w:tcPr>
           <w:p>
@@ -3839,7 +3839,7 @@
                 <w:color w:val="000000"/>
                 <w:sz w:val="20"/>
               </w:rPr>
-              <w:t>0,3689</w:t>
+              <w:t>0,3702</w:t>
             </w:r>
           </w:p>
         </w:tc>
@@ -3921,12 +3921,12 @@
     </w:p>
     <w:p>
       <w:r>
-        <w:t>Para caracterizar el rango de profundidad útil del sistema se estima la distancia entre el objeto y la cámara para cada instancia anotada de las mismas 198 fotografías, sin capturas adicionales. El modelo estenopeico de la cámara entrega d ≈ f_px · H_cls / h_px, donde f_px es la distancia focal en píxeles —calculada del campo FocalLengthIn35mmFilm del EXIF (equivalente a 25 mm para el lente 1x y a 14 mm para el 0,5x; en 7 de las 198 fotografías el EXIF no coincide con lo previsto en el protocolo y se adoptó el valor del EXIF)—, h_px es la altura de la caja anotada en píxeles y H_cls es una altura de referencia fija por clase (persona 1,70 m; nevera 1,75 m; silla 0,90 m; sofá 0,85 m; inodoro 0,78 m; mesa de comedor 0,76 m; lavamanos 0,80 m; televisor 0,60 m; cama 0,60 m; computador portátil 0,25 m). Las distancias resultantes son aproximaciones, no mediciones, por lo que el análisis se reporta exclusivamente en bandas.</w:t>
+        <w:t>Para caracterizar el rango de profundidad útil del sistema se estima la distancia entre el objeto y la cámara para cada instancia anotada de las mismas 198 fotografías, sin capturas adicionales. El modelo estenopeico de la cámara entrega d ≈ f_px · H_cls / h_px, donde f_px es la distancia focal en píxeles —calculada del campo FocalLengthIn35mmFilm del EXIF (equivalente a 25 mm para el lente 1x y a 14 mm para el 0,5x; se registraron seis discrepancias de grupo de lente y una variación menor de 25 a 26 mm y se adoptó el valor del EXIF)—, h_px es la altura de la caja anotada en píxeles y H_cls es una altura de referencia fija por clase (persona 1,70 m; nevera 1,75 m; silla 0,90 m; sofá 0,85 m; inodoro 0,78 m; mesa de comedor 0,76 m; lavamanos 0,80 m; televisor 0,60 m; cama 0,60 m; computador portátil 0,25 m). Las distancias resultantes son aproximaciones, no mediciones, por lo que el análisis se reporta exclusivamente en bandas.</w:t>
       </w:r>
     </w:p>
     <w:p>
       <w:r>
-        <w:t>La tabla siguiente resume el recall del detector por banda de distancia estimada agregando las seis configuraciones. "Recall" se calcula agrupando todas las instancias de la banda; "Media por grupo" y su IC 95 % ponderan por los 33 grupos de captura (bootstrap de 10 000 remuestreos, semilla 20261013).</w:t>
+        <w:t>La tabla siguiente resume el recall del detector por banda de distancia estimada agregando las seis configuraciones. "Recall" se calcula agrupando todas las instancias de la banda; "Media bootstrap" y su IC 95 % se obtienen remuestreando los 33 grupos de captura completos y calculando el recall agrupado en cada remuestra (10 000 remuestreos, semilla 20261013); no son una media de recalls igualmente ponderados por escena.</w:t>
       </w:r>
     </w:p>
     <w:tbl>
@@ -3945,13 +3945,13 @@
         </w:tblBorders>
       </w:tblPr>
       <w:tblGrid>
-        <w:gridCol w:w="1368"/>
-        <w:gridCol w:w="1037"/>
-        <w:gridCol w:w="1037"/>
-        <w:gridCol w:w="864"/>
-        <w:gridCol w:w="1224"/>
-        <w:gridCol w:w="1584"/>
-        <w:gridCol w:w="2160"/>
+        <w:gridCol w:w="1332"/>
+        <w:gridCol w:w="1009"/>
+        <w:gridCol w:w="1009"/>
+        <w:gridCol w:w="841"/>
+        <w:gridCol w:w="1192"/>
+        <w:gridCol w:w="1542"/>
+        <w:gridCol w:w="2103"/>
       </w:tblGrid>
       <w:tr>
         <w:trPr>
@@ -3960,7 +3960,7 @@
         </w:trPr>
         <w:tc>
           <w:tcPr>
-            <w:tcW w:type="dxa" w:w="1290"/>
+            <w:tcW w:type="dxa" w:w="1332"/>
             <w:vAlign w:val="center"/>
           </w:tcPr>
           <w:p>
@@ -3980,7 +3980,7 @@
         </w:tc>
         <w:tc>
           <w:tcPr>
-            <w:tcW w:type="dxa" w:w="1290"/>
+            <w:tcW w:type="dxa" w:w="1009"/>
             <w:vAlign w:val="center"/>
           </w:tcPr>
           <w:p>
@@ -4000,7 +4000,7 @@
         </w:tc>
         <w:tc>
           <w:tcPr>
-            <w:tcW w:type="dxa" w:w="1290"/>
+            <w:tcW w:type="dxa" w:w="1009"/>
             <w:vAlign w:val="center"/>
           </w:tcPr>
           <w:p>
@@ -4020,7 +4020,7 @@
         </w:tc>
         <w:tc>
           <w:tcPr>
-            <w:tcW w:type="dxa" w:w="1290"/>
+            <w:tcW w:type="dxa" w:w="841"/>
             <w:vAlign w:val="center"/>
           </w:tcPr>
           <w:p>
@@ -4040,7 +4040,7 @@
         </w:tc>
         <w:tc>
           <w:tcPr>
-            <w:tcW w:type="dxa" w:w="1290"/>
+            <w:tcW w:type="dxa" w:w="1192"/>
             <w:vAlign w:val="center"/>
           </w:tcPr>
           <w:p>
@@ -4054,13 +4054,13 @@
                 <w:color w:val="000000"/>
                 <w:sz w:val="20"/>
               </w:rPr>
-              <w:t>Media por grupo</w:t>
+              <w:t>Media bootstrap</w:t>
             </w:r>
           </w:p>
         </w:tc>
         <w:tc>
           <w:tcPr>
-            <w:tcW w:type="dxa" w:w="1290"/>
+            <w:tcW w:type="dxa" w:w="1542"/>
             <w:vAlign w:val="center"/>
           </w:tcPr>
           <w:p>
@@ -4080,7 +4080,7 @@
         </w:tc>
         <w:tc>
           <w:tcPr>
-            <w:tcW w:type="dxa" w:w="1290"/>
+            <w:tcW w:type="dxa" w:w="2103"/>
             <w:vAlign w:val="center"/>
           </w:tcPr>
           <w:p>
@@ -4105,7 +4105,7 @@
         </w:trPr>
         <w:tc>
           <w:tcPr>
-            <w:tcW w:type="dxa" w:w="1368"/>
+            <w:tcW w:type="dxa" w:w="1332"/>
             <w:vAlign w:val="center"/>
           </w:tcPr>
           <w:p>
@@ -4125,7 +4125,7 @@
         </w:tc>
         <w:tc>
           <w:tcPr>
-            <w:tcW w:type="dxa" w:w="1037"/>
+            <w:tcW w:type="dxa" w:w="1009"/>
             <w:vAlign w:val="center"/>
           </w:tcPr>
           <w:p>
@@ -4145,7 +4145,7 @@
         </w:tc>
         <w:tc>
           <w:tcPr>
-            <w:tcW w:type="dxa" w:w="1037"/>
+            <w:tcW w:type="dxa" w:w="1009"/>
             <w:vAlign w:val="center"/>
           </w:tcPr>
           <w:p>
@@ -4165,7 +4165,7 @@
         </w:tc>
         <w:tc>
           <w:tcPr>
-            <w:tcW w:type="dxa" w:w="864"/>
+            <w:tcW w:type="dxa" w:w="841"/>
             <w:vAlign w:val="center"/>
           </w:tcPr>
           <w:p>
@@ -4185,7 +4185,7 @@
         </w:tc>
         <w:tc>
           <w:tcPr>
-            <w:tcW w:type="dxa" w:w="1224"/>
+            <w:tcW w:type="dxa" w:w="1192"/>
             <w:vAlign w:val="center"/>
           </w:tcPr>
           <w:p>
@@ -4205,7 +4205,7 @@
         </w:tc>
         <w:tc>
           <w:tcPr>
-            <w:tcW w:type="dxa" w:w="1584"/>
+            <w:tcW w:type="dxa" w:w="1542"/>
             <w:vAlign w:val="center"/>
           </w:tcPr>
           <w:p>
@@ -4225,7 +4225,7 @@
         </w:tc>
         <w:tc>
           <w:tcPr>
-            <w:tcW w:type="dxa" w:w="2160"/>
+            <w:tcW w:type="dxa" w:w="2103"/>
             <w:vAlign w:val="center"/>
           </w:tcPr>
           <w:p>
@@ -4250,7 +4250,7 @@
         </w:trPr>
         <w:tc>
           <w:tcPr>
-            <w:tcW w:type="dxa" w:w="1368"/>
+            <w:tcW w:type="dxa" w:w="1332"/>
             <w:vAlign w:val="center"/>
           </w:tcPr>
           <w:p>
@@ -4270,7 +4270,7 @@
         </w:tc>
         <w:tc>
           <w:tcPr>
-            <w:tcW w:type="dxa" w:w="1037"/>
+            <w:tcW w:type="dxa" w:w="1009"/>
             <w:vAlign w:val="center"/>
           </w:tcPr>
           <w:p>
@@ -4290,7 +4290,7 @@
         </w:tc>
         <w:tc>
           <w:tcPr>
-            <w:tcW w:type="dxa" w:w="1037"/>
+            <w:tcW w:type="dxa" w:w="1009"/>
             <w:vAlign w:val="center"/>
           </w:tcPr>
           <w:p>
@@ -4310,7 +4310,7 @@
         </w:tc>
         <w:tc>
           <w:tcPr>
-            <w:tcW w:type="dxa" w:w="864"/>
+            <w:tcW w:type="dxa" w:w="841"/>
             <w:vAlign w:val="center"/>
           </w:tcPr>
           <w:p>
@@ -4330,7 +4330,7 @@
         </w:tc>
         <w:tc>
           <w:tcPr>
-            <w:tcW w:type="dxa" w:w="1224"/>
+            <w:tcW w:type="dxa" w:w="1192"/>
             <w:vAlign w:val="center"/>
           </w:tcPr>
           <w:p>
@@ -4350,7 +4350,7 @@
         </w:tc>
         <w:tc>
           <w:tcPr>
-            <w:tcW w:type="dxa" w:w="1584"/>
+            <w:tcW w:type="dxa" w:w="1542"/>
             <w:vAlign w:val="center"/>
           </w:tcPr>
           <w:p>
@@ -4370,7 +4370,7 @@
         </w:tc>
         <w:tc>
           <w:tcPr>
-            <w:tcW w:type="dxa" w:w="2160"/>
+            <w:tcW w:type="dxa" w:w="2103"/>
             <w:vAlign w:val="center"/>
           </w:tcPr>
           <w:p>
@@ -4395,7 +4395,7 @@
         </w:trPr>
         <w:tc>
           <w:tcPr>
-            <w:tcW w:type="dxa" w:w="1368"/>
+            <w:tcW w:type="dxa" w:w="1332"/>
             <w:vAlign w:val="center"/>
           </w:tcPr>
           <w:p>
@@ -4415,7 +4415,7 @@
         </w:tc>
         <w:tc>
           <w:tcPr>
-            <w:tcW w:type="dxa" w:w="1037"/>
+            <w:tcW w:type="dxa" w:w="1009"/>
             <w:vAlign w:val="center"/>
           </w:tcPr>
           <w:p>
@@ -4435,7 +4435,7 @@
         </w:tc>
         <w:tc>
           <w:tcPr>
-            <w:tcW w:type="dxa" w:w="1037"/>
+            <w:tcW w:type="dxa" w:w="1009"/>
             <w:vAlign w:val="center"/>
           </w:tcPr>
           <w:p>
@@ -4455,7 +4455,7 @@
         </w:tc>
         <w:tc>
           <w:tcPr>
-            <w:tcW w:type="dxa" w:w="864"/>
+            <w:tcW w:type="dxa" w:w="841"/>
             <w:vAlign w:val="center"/>
           </w:tcPr>
           <w:p>
@@ -4475,7 +4475,7 @@
         </w:tc>
         <w:tc>
           <w:tcPr>
-            <w:tcW w:type="dxa" w:w="1224"/>
+            <w:tcW w:type="dxa" w:w="1192"/>
             <w:vAlign w:val="center"/>
           </w:tcPr>
           <w:p>
@@ -4495,7 +4495,7 @@
         </w:tc>
         <w:tc>
           <w:tcPr>
-            <w:tcW w:type="dxa" w:w="1584"/>
+            <w:tcW w:type="dxa" w:w="1542"/>
             <w:vAlign w:val="center"/>
           </w:tcPr>
           <w:p>
@@ -4515,7 +4515,7 @@
         </w:tc>
         <w:tc>
           <w:tcPr>
-            <w:tcW w:type="dxa" w:w="2160"/>
+            <w:tcW w:type="dxa" w:w="2103"/>
             <w:vAlign w:val="center"/>
           </w:tcPr>
           <w:p>
@@ -4540,7 +4540,7 @@
         </w:trPr>
         <w:tc>
           <w:tcPr>
-            <w:tcW w:type="dxa" w:w="1368"/>
+            <w:tcW w:type="dxa" w:w="1332"/>
             <w:vAlign w:val="center"/>
           </w:tcPr>
           <w:p>
@@ -4560,7 +4560,7 @@
         </w:tc>
         <w:tc>
           <w:tcPr>
-            <w:tcW w:type="dxa" w:w="1037"/>
+            <w:tcW w:type="dxa" w:w="1009"/>
             <w:vAlign w:val="center"/>
           </w:tcPr>
           <w:p>
@@ -4580,7 +4580,7 @@
         </w:tc>
         <w:tc>
           <w:tcPr>
-            <w:tcW w:type="dxa" w:w="1037"/>
+            <w:tcW w:type="dxa" w:w="1009"/>
             <w:vAlign w:val="center"/>
           </w:tcPr>
           <w:p>
@@ -4600,7 +4600,7 @@
         </w:tc>
         <w:tc>
           <w:tcPr>
-            <w:tcW w:type="dxa" w:w="864"/>
+            <w:tcW w:type="dxa" w:w="841"/>
             <w:vAlign w:val="center"/>
           </w:tcPr>
           <w:p>
@@ -4620,7 +4620,7 @@
         </w:tc>
         <w:tc>
           <w:tcPr>
-            <w:tcW w:type="dxa" w:w="1224"/>
+            <w:tcW w:type="dxa" w:w="1192"/>
             <w:vAlign w:val="center"/>
           </w:tcPr>
           <w:p>
@@ -4640,7 +4640,7 @@
         </w:tc>
         <w:tc>
           <w:tcPr>
-            <w:tcW w:type="dxa" w:w="1584"/>
+            <w:tcW w:type="dxa" w:w="1542"/>
             <w:vAlign w:val="center"/>
           </w:tcPr>
           <w:p>
@@ -4660,7 +4660,7 @@
         </w:tc>
         <w:tc>
           <w:tcPr>
-            <w:tcW w:type="dxa" w:w="2160"/>
+            <w:tcW w:type="dxa" w:w="2103"/>
             <w:vAlign w:val="center"/>
           </w:tcPr>
           <w:p>
@@ -4685,7 +4685,7 @@
         </w:trPr>
         <w:tc>
           <w:tcPr>
-            <w:tcW w:type="dxa" w:w="1368"/>
+            <w:tcW w:type="dxa" w:w="1332"/>
             <w:vAlign w:val="center"/>
           </w:tcPr>
           <w:p>
@@ -4705,7 +4705,7 @@
         </w:tc>
         <w:tc>
           <w:tcPr>
-            <w:tcW w:type="dxa" w:w="1037"/>
+            <w:tcW w:type="dxa" w:w="1009"/>
             <w:vAlign w:val="center"/>
           </w:tcPr>
           <w:p>
@@ -4725,7 +4725,7 @@
         </w:tc>
         <w:tc>
           <w:tcPr>
-            <w:tcW w:type="dxa" w:w="1037"/>
+            <w:tcW w:type="dxa" w:w="1009"/>
             <w:vAlign w:val="center"/>
           </w:tcPr>
           <w:p>
@@ -4745,7 +4745,7 @@
         </w:tc>
         <w:tc>
           <w:tcPr>
-            <w:tcW w:type="dxa" w:w="864"/>
+            <w:tcW w:type="dxa" w:w="841"/>
             <w:vAlign w:val="center"/>
           </w:tcPr>
           <w:p>
@@ -4765,7 +4765,7 @@
         </w:tc>
         <w:tc>
           <w:tcPr>
-            <w:tcW w:type="dxa" w:w="1224"/>
+            <w:tcW w:type="dxa" w:w="1192"/>
             <w:vAlign w:val="center"/>
           </w:tcPr>
           <w:p>
@@ -4785,7 +4785,7 @@
         </w:tc>
         <w:tc>
           <w:tcPr>
-            <w:tcW w:type="dxa" w:w="1584"/>
+            <w:tcW w:type="dxa" w:w="1542"/>
             <w:vAlign w:val="center"/>
           </w:tcPr>
           <w:p>
@@ -4805,7 +4805,7 @@
         </w:tc>
         <w:tc>
           <w:tcPr>
-            <w:tcW w:type="dxa" w:w="2160"/>
+            <w:tcW w:type="dxa" w:w="2103"/>
             <w:vAlign w:val="center"/>
           </w:tcPr>
           <w:p>
@@ -4830,7 +4830,7 @@
         </w:trPr>
         <w:tc>
           <w:tcPr>
-            <w:tcW w:type="dxa" w:w="1368"/>
+            <w:tcW w:type="dxa" w:w="1332"/>
             <w:vAlign w:val="center"/>
           </w:tcPr>
           <w:p>
@@ -4850,7 +4850,7 @@
         </w:tc>
         <w:tc>
           <w:tcPr>
-            <w:tcW w:type="dxa" w:w="1037"/>
+            <w:tcW w:type="dxa" w:w="1009"/>
             <w:vAlign w:val="center"/>
           </w:tcPr>
           <w:p>
@@ -4870,7 +4870,7 @@
         </w:tc>
         <w:tc>
           <w:tcPr>
-            <w:tcW w:type="dxa" w:w="1037"/>
+            <w:tcW w:type="dxa" w:w="1009"/>
             <w:vAlign w:val="center"/>
           </w:tcPr>
           <w:p>
@@ -4890,7 +4890,7 @@
         </w:tc>
         <w:tc>
           <w:tcPr>
-            <w:tcW w:type="dxa" w:w="864"/>
+            <w:tcW w:type="dxa" w:w="841"/>
             <w:vAlign w:val="center"/>
           </w:tcPr>
           <w:p>
@@ -4910,7 +4910,7 @@
         </w:tc>
         <w:tc>
           <w:tcPr>
-            <w:tcW w:type="dxa" w:w="1224"/>
+            <w:tcW w:type="dxa" w:w="1192"/>
             <w:vAlign w:val="center"/>
           </w:tcPr>
           <w:p>
@@ -4930,7 +4930,7 @@
         </w:tc>
         <w:tc>
           <w:tcPr>
-            <w:tcW w:type="dxa" w:w="1584"/>
+            <w:tcW w:type="dxa" w:w="1542"/>
             <w:vAlign w:val="center"/>
           </w:tcPr>
           <w:p>
@@ -4950,7 +4950,7 @@
         </w:tc>
         <w:tc>
           <w:tcPr>
-            <w:tcW w:type="dxa" w:w="2160"/>
+            <w:tcW w:type="dxa" w:w="2103"/>
             <w:vAlign w:val="center"/>
           </w:tcPr>
           <w:p>
@@ -5028,7 +5028,7 @@
     </w:p>
     <w:p>
       <w:r>
-        <w:t>El recall se mantiene entre 60 % y 75 % hasta aproximadamente 4 m (bandas 0,5-1 m: 75,3%; 1-2 m: 66,2%; 2-3 m: 62,5%; 3-4 m: 62,2%), cae a 36,6% en 4-6 m y colapsa a 17,6% a partir de 6 m. Bajo un criterio operativo de recall ≥ 50 % con al menos 30 instancias anotadas por banda, el rango de detección sugerido para el prototipo es de unos 4 metros: los objetos más lejanos deberían presentarse al usuario con baja confianza o quedar fuera del alcance del asistente.</w:t>
+        <w:t>El recall se mantiene entre 60 % y 75 % hasta aproximadamente 4 m (bandas 0,5-1 m: 75,3%; 1-2 m: 66,2%; 2-3 m: 62,5%; 3-4 m: 62,2%), cae a 36,6% en 4-6 m y colapsa a 17,6% a partir de 6 m. Bajo un criterio operativo de recall ≥ 50 % con al menos 30 instancias anotadas por banda, el rango de detección sugerido para el conjunto muestra una transición alrededor de la banda de 4 m. Esta observación no permite fijar un límite operativo ni filtrar objetos por distancia: las distancias no fueron medidas y la aplicación no estima profundidad.</w:t>
       </w:r>
     </w:p>
     <w:p>
@@ -5038,7 +5038,7 @@
     </w:p>
     <w:p>
       <w:r>
-        <w:t>Tres limitaciones condicionan esta conclusión. Primero, la incertidumbre de la altura de referencia por clase es proporcional (~±30 %), de manera que una instancia puede desplazarse una banda. Segundo, los objetos parcialmente ocultos pierden altura visible en la caja, lo que sobreestima su distancia. Tercero, la mezcla de clases cambia con la distancia (las bandas cercanas concentran camas y computadores; las lejanas, sillas), por lo que el recall por banda mezcla profundidad con dificultad por clase. El resultado debe entenderse como una guía operacional del prototipo —priorizar objetos a menos de ~4 m— y no como una caracterización del sensor; su adopción como restricción de producto requiere validación con distancias medidas en escenas nuevas.</w:t>
+        <w:t>Tres limitaciones condicionan esta conclusión. Primero, la incertidumbre de la altura de referencia por clase no se cuantificó empíricamente, por lo que una instancia puede desplazarse de banda. Segundo, los objetos parcialmente ocultos pierden altura visible en la caja, lo que sobreestima su distancia. Tercero, la mezcla de clases cambia con la distancia (las bandas cercanas concentran camas y computadores; las lejanas, sillas), por lo que el recall por banda mezcla profundidad con dificultad por clase. El resultado no caracteriza el sensor ni justifica limitar el asistente a 4 m. Se requiere validación con distancias medidas en escenas nuevas. Los intervalos bootstrap describen el muestreo de instancias por grupos y no incorporan el error de estimación de distancia.</w:t>
       </w:r>
     </w:p>
     <w:p>
@@ -5046,12 +5046,12 @@
         <w:pStyle w:val="Heading1"/>
       </w:pPr>
       <w:r>
-        <w:t>4.5 Métricas complementarias con métodos bioinspirados</w:t>
+        <w:t>4.5 Métricas complementarias de detección</w:t>
       </w:r>
     </w:p>
     <w:p>
       <w:r>
-        <w:t>Los detectores evaluados son métodos bioinspirados: redes neuronales convolucionales de una sola pasada cuyo procesamiento jerárquico de la imagen imita los estadios de la corteza visual. Como métricas complementarias al conteo bruto de objetos se reportan, por configuración, la media de objetos visibles y correctos por fotografía, el recall, la precisión, la F1 y las métricas COCO AP50/AP50-95, además de las métricas de la lista de anuncios con el límite de dos objetos.</w:t>
+        <w:t>Como complemento de los conteos se reportan precisión, recall, F1 y AP. Se conserva la interpretación de cada métrica y se acompaña de resultados por clase para identificar el efecto del desbalance. No se implementó ni evaluó un algoritmo bioinspirado adicional; esa propuesta requeriría definir su método y protocolo antes de atribuirle resultados.</w:t>
       </w:r>
     </w:p>
     <w:tbl>
@@ -5070,15 +5070,15 @@
         </w:tblBorders>
       </w:tblPr>
       <w:tblGrid>
-        <w:gridCol w:w="1901"/>
-        <w:gridCol w:w="1037"/>
-        <w:gridCol w:w="1080"/>
-        <w:gridCol w:w="792"/>
-        <w:gridCol w:w="864"/>
-        <w:gridCol w:w="648"/>
-        <w:gridCol w:w="1440"/>
-        <w:gridCol w:w="936"/>
-        <w:gridCol w:w="936"/>
+        <w:gridCol w:w="1782"/>
+        <w:gridCol w:w="972"/>
+        <w:gridCol w:w="1012"/>
+        <w:gridCol w:w="742"/>
+        <w:gridCol w:w="810"/>
+        <w:gridCol w:w="607"/>
+        <w:gridCol w:w="1350"/>
+        <w:gridCol w:w="877"/>
+        <w:gridCol w:w="877"/>
       </w:tblGrid>
       <w:tr>
         <w:trPr>
@@ -5087,7 +5087,7 @@
         </w:trPr>
         <w:tc>
           <w:tcPr>
-            <w:tcW w:type="dxa" w:w="1003"/>
+            <w:tcW w:type="dxa" w:w="1782"/>
             <w:vAlign w:val="center"/>
           </w:tcPr>
           <w:p>
@@ -5107,7 +5107,7 @@
         </w:tc>
         <w:tc>
           <w:tcPr>
-            <w:tcW w:type="dxa" w:w="1003"/>
+            <w:tcW w:type="dxa" w:w="972"/>
             <w:vAlign w:val="center"/>
           </w:tcPr>
           <w:p>
@@ -5127,7 +5127,7 @@
         </w:tc>
         <w:tc>
           <w:tcPr>
-            <w:tcW w:type="dxa" w:w="1003"/>
+            <w:tcW w:type="dxa" w:w="1012"/>
             <w:vAlign w:val="center"/>
           </w:tcPr>
           <w:p>
@@ -5147,7 +5147,7 @@
         </w:tc>
         <w:tc>
           <w:tcPr>
-            <w:tcW w:type="dxa" w:w="1003"/>
+            <w:tcW w:type="dxa" w:w="742"/>
             <w:vAlign w:val="center"/>
           </w:tcPr>
           <w:p>
@@ -5167,7 +5167,7 @@
         </w:tc>
         <w:tc>
           <w:tcPr>
-            <w:tcW w:type="dxa" w:w="1003"/>
+            <w:tcW w:type="dxa" w:w="810"/>
             <w:vAlign w:val="center"/>
           </w:tcPr>
           <w:p>
@@ -5187,7 +5187,7 @@
         </w:tc>
         <w:tc>
           <w:tcPr>
-            <w:tcW w:type="dxa" w:w="1003"/>
+            <w:tcW w:type="dxa" w:w="607"/>
             <w:vAlign w:val="center"/>
           </w:tcPr>
           <w:p>
@@ -5207,7 +5207,7 @@
         </w:tc>
         <w:tc>
           <w:tcPr>
-            <w:tcW w:type="dxa" w:w="1003"/>
+            <w:tcW w:type="dxa" w:w="1350"/>
             <w:vAlign w:val="center"/>
           </w:tcPr>
           <w:p>
@@ -5227,7 +5227,7 @@
         </w:tc>
         <w:tc>
           <w:tcPr>
-            <w:tcW w:type="dxa" w:w="1003"/>
+            <w:tcW w:type="dxa" w:w="877"/>
             <w:vAlign w:val="center"/>
           </w:tcPr>
           <w:p>
@@ -5247,7 +5247,7 @@
         </w:tc>
         <w:tc>
           <w:tcPr>
-            <w:tcW w:type="dxa" w:w="1003"/>
+            <w:tcW w:type="dxa" w:w="877"/>
             <w:vAlign w:val="center"/>
           </w:tcPr>
           <w:p>
@@ -5272,7 +5272,7 @@
         </w:trPr>
         <w:tc>
           <w:tcPr>
-            <w:tcW w:type="dxa" w:w="1901"/>
+            <w:tcW w:type="dxa" w:w="1782"/>
             <w:vAlign w:val="center"/>
           </w:tcPr>
           <w:p>
@@ -5292,7 +5292,7 @@
         </w:tc>
         <w:tc>
           <w:tcPr>
-            <w:tcW w:type="dxa" w:w="1037"/>
+            <w:tcW w:type="dxa" w:w="972"/>
             <w:vAlign w:val="center"/>
           </w:tcPr>
           <w:p>
@@ -5312,7 +5312,7 @@
         </w:tc>
         <w:tc>
           <w:tcPr>
-            <w:tcW w:type="dxa" w:w="1080"/>
+            <w:tcW w:type="dxa" w:w="1012"/>
             <w:vAlign w:val="center"/>
           </w:tcPr>
           <w:p>
@@ -5332,7 +5332,7 @@
         </w:tc>
         <w:tc>
           <w:tcPr>
-            <w:tcW w:type="dxa" w:w="792"/>
+            <w:tcW w:type="dxa" w:w="742"/>
             <w:vAlign w:val="center"/>
           </w:tcPr>
           <w:p>
@@ -5352,7 +5352,7 @@
         </w:tc>
         <w:tc>
           <w:tcPr>
-            <w:tcW w:type="dxa" w:w="864"/>
+            <w:tcW w:type="dxa" w:w="810"/>
             <w:vAlign w:val="center"/>
           </w:tcPr>
           <w:p>
@@ -5372,7 +5372,7 @@
         </w:tc>
         <w:tc>
           <w:tcPr>
-            <w:tcW w:type="dxa" w:w="648"/>
+            <w:tcW w:type="dxa" w:w="607"/>
             <w:vAlign w:val="center"/>
           </w:tcPr>
           <w:p>
@@ -5392,7 +5392,7 @@
         </w:tc>
         <w:tc>
           <w:tcPr>
-            <w:tcW w:type="dxa" w:w="1440"/>
+            <w:tcW w:type="dxa" w:w="1350"/>
             <w:vAlign w:val="center"/>
           </w:tcPr>
           <w:p>
@@ -5412,7 +5412,7 @@
         </w:tc>
         <w:tc>
           <w:tcPr>
-            <w:tcW w:type="dxa" w:w="936"/>
+            <w:tcW w:type="dxa" w:w="877"/>
             <w:vAlign w:val="center"/>
           </w:tcPr>
           <w:p>
@@ -5432,7 +5432,7 @@
         </w:tc>
         <w:tc>
           <w:tcPr>
-            <w:tcW w:type="dxa" w:w="936"/>
+            <w:tcW w:type="dxa" w:w="877"/>
             <w:vAlign w:val="center"/>
           </w:tcPr>
           <w:p>
@@ -5457,7 +5457,7 @@
         </w:trPr>
         <w:tc>
           <w:tcPr>
-            <w:tcW w:type="dxa" w:w="1901"/>
+            <w:tcW w:type="dxa" w:w="1782"/>
             <w:vAlign w:val="center"/>
           </w:tcPr>
           <w:p>
@@ -5477,7 +5477,7 @@
         </w:tc>
         <w:tc>
           <w:tcPr>
-            <w:tcW w:type="dxa" w:w="1037"/>
+            <w:tcW w:type="dxa" w:w="972"/>
             <w:vAlign w:val="center"/>
           </w:tcPr>
           <w:p>
@@ -5497,7 +5497,7 @@
         </w:tc>
         <w:tc>
           <w:tcPr>
-            <w:tcW w:type="dxa" w:w="1080"/>
+            <w:tcW w:type="dxa" w:w="1012"/>
             <w:vAlign w:val="center"/>
           </w:tcPr>
           <w:p>
@@ -5517,7 +5517,7 @@
         </w:tc>
         <w:tc>
           <w:tcPr>
-            <w:tcW w:type="dxa" w:w="792"/>
+            <w:tcW w:type="dxa" w:w="742"/>
             <w:vAlign w:val="center"/>
           </w:tcPr>
           <w:p>
@@ -5537,7 +5537,7 @@
         </w:tc>
         <w:tc>
           <w:tcPr>
-            <w:tcW w:type="dxa" w:w="864"/>
+            <w:tcW w:type="dxa" w:w="810"/>
             <w:vAlign w:val="center"/>
           </w:tcPr>
           <w:p>
@@ -5557,7 +5557,7 @@
         </w:tc>
         <w:tc>
           <w:tcPr>
-            <w:tcW w:type="dxa" w:w="648"/>
+            <w:tcW w:type="dxa" w:w="607"/>
             <w:vAlign w:val="center"/>
           </w:tcPr>
           <w:p>
@@ -5577,7 +5577,7 @@
         </w:tc>
         <w:tc>
           <w:tcPr>
-            <w:tcW w:type="dxa" w:w="1440"/>
+            <w:tcW w:type="dxa" w:w="1350"/>
             <w:vAlign w:val="center"/>
           </w:tcPr>
           <w:p>
@@ -5597,7 +5597,7 @@
         </w:tc>
         <w:tc>
           <w:tcPr>
-            <w:tcW w:type="dxa" w:w="936"/>
+            <w:tcW w:type="dxa" w:w="877"/>
             <w:vAlign w:val="center"/>
           </w:tcPr>
           <w:p>
@@ -5617,7 +5617,7 @@
         </w:tc>
         <w:tc>
           <w:tcPr>
-            <w:tcW w:type="dxa" w:w="936"/>
+            <w:tcW w:type="dxa" w:w="877"/>
             <w:vAlign w:val="center"/>
           </w:tcPr>
           <w:p>
@@ -5642,7 +5642,7 @@
         </w:trPr>
         <w:tc>
           <w:tcPr>
-            <w:tcW w:type="dxa" w:w="1901"/>
+            <w:tcW w:type="dxa" w:w="1782"/>
             <w:vAlign w:val="center"/>
           </w:tcPr>
           <w:p>
@@ -5662,7 +5662,7 @@
         </w:tc>
         <w:tc>
           <w:tcPr>
-            <w:tcW w:type="dxa" w:w="1037"/>
+            <w:tcW w:type="dxa" w:w="972"/>
             <w:vAlign w:val="center"/>
           </w:tcPr>
           <w:p>
@@ -5682,7 +5682,7 @@
         </w:tc>
         <w:tc>
           <w:tcPr>
-            <w:tcW w:type="dxa" w:w="1080"/>
+            <w:tcW w:type="dxa" w:w="1012"/>
             <w:vAlign w:val="center"/>
           </w:tcPr>
           <w:p>
@@ -5702,7 +5702,7 @@
         </w:tc>
         <w:tc>
           <w:tcPr>
-            <w:tcW w:type="dxa" w:w="792"/>
+            <w:tcW w:type="dxa" w:w="742"/>
             <w:vAlign w:val="center"/>
           </w:tcPr>
           <w:p>
@@ -5722,7 +5722,7 @@
         </w:tc>
         <w:tc>
           <w:tcPr>
-            <w:tcW w:type="dxa" w:w="864"/>
+            <w:tcW w:type="dxa" w:w="810"/>
             <w:vAlign w:val="center"/>
           </w:tcPr>
           <w:p>
@@ -5742,7 +5742,7 @@
         </w:tc>
         <w:tc>
           <w:tcPr>
-            <w:tcW w:type="dxa" w:w="648"/>
+            <w:tcW w:type="dxa" w:w="607"/>
             <w:vAlign w:val="center"/>
           </w:tcPr>
           <w:p>
@@ -5762,7 +5762,7 @@
         </w:tc>
         <w:tc>
           <w:tcPr>
-            <w:tcW w:type="dxa" w:w="1440"/>
+            <w:tcW w:type="dxa" w:w="1350"/>
             <w:vAlign w:val="center"/>
           </w:tcPr>
           <w:p>
@@ -5782,7 +5782,7 @@
         </w:tc>
         <w:tc>
           <w:tcPr>
-            <w:tcW w:type="dxa" w:w="936"/>
+            <w:tcW w:type="dxa" w:w="877"/>
             <w:vAlign w:val="center"/>
           </w:tcPr>
           <w:p>
@@ -5802,7 +5802,7 @@
         </w:tc>
         <w:tc>
           <w:tcPr>
-            <w:tcW w:type="dxa" w:w="936"/>
+            <w:tcW w:type="dxa" w:w="877"/>
             <w:vAlign w:val="center"/>
           </w:tcPr>
           <w:p>
@@ -5827,7 +5827,7 @@
         </w:trPr>
         <w:tc>
           <w:tcPr>
-            <w:tcW w:type="dxa" w:w="1901"/>
+            <w:tcW w:type="dxa" w:w="1782"/>
             <w:vAlign w:val="center"/>
           </w:tcPr>
           <w:p>
@@ -5847,7 +5847,7 @@
         </w:tc>
         <w:tc>
           <w:tcPr>
-            <w:tcW w:type="dxa" w:w="1037"/>
+            <w:tcW w:type="dxa" w:w="972"/>
             <w:vAlign w:val="center"/>
           </w:tcPr>
           <w:p>
@@ -5867,7 +5867,7 @@
         </w:tc>
         <w:tc>
           <w:tcPr>
-            <w:tcW w:type="dxa" w:w="1080"/>
+            <w:tcW w:type="dxa" w:w="1012"/>
             <w:vAlign w:val="center"/>
           </w:tcPr>
           <w:p>
@@ -5887,7 +5887,7 @@
         </w:tc>
         <w:tc>
           <w:tcPr>
-            <w:tcW w:type="dxa" w:w="792"/>
+            <w:tcW w:type="dxa" w:w="742"/>
             <w:vAlign w:val="center"/>
           </w:tcPr>
           <w:p>
@@ -5907,7 +5907,7 @@
         </w:tc>
         <w:tc>
           <w:tcPr>
-            <w:tcW w:type="dxa" w:w="864"/>
+            <w:tcW w:type="dxa" w:w="810"/>
             <w:vAlign w:val="center"/>
           </w:tcPr>
           <w:p>
@@ -5927,7 +5927,7 @@
         </w:tc>
         <w:tc>
           <w:tcPr>
-            <w:tcW w:type="dxa" w:w="648"/>
+            <w:tcW w:type="dxa" w:w="607"/>
             <w:vAlign w:val="center"/>
           </w:tcPr>
           <w:p>
@@ -5947,7 +5947,7 @@
         </w:tc>
         <w:tc>
           <w:tcPr>
-            <w:tcW w:type="dxa" w:w="1440"/>
+            <w:tcW w:type="dxa" w:w="1350"/>
             <w:vAlign w:val="center"/>
           </w:tcPr>
           <w:p>
@@ -5967,7 +5967,7 @@
         </w:tc>
         <w:tc>
           <w:tcPr>
-            <w:tcW w:type="dxa" w:w="936"/>
+            <w:tcW w:type="dxa" w:w="877"/>
             <w:vAlign w:val="center"/>
           </w:tcPr>
           <w:p>
@@ -5987,7 +5987,7 @@
         </w:tc>
         <w:tc>
           <w:tcPr>
-            <w:tcW w:type="dxa" w:w="936"/>
+            <w:tcW w:type="dxa" w:w="877"/>
             <w:vAlign w:val="center"/>
           </w:tcPr>
           <w:p>
@@ -6012,7 +6012,7 @@
         </w:trPr>
         <w:tc>
           <w:tcPr>
-            <w:tcW w:type="dxa" w:w="1901"/>
+            <w:tcW w:type="dxa" w:w="1782"/>
             <w:vAlign w:val="center"/>
           </w:tcPr>
           <w:p>
@@ -6032,7 +6032,7 @@
         </w:tc>
         <w:tc>
           <w:tcPr>
-            <w:tcW w:type="dxa" w:w="1037"/>
+            <w:tcW w:type="dxa" w:w="972"/>
             <w:vAlign w:val="center"/>
           </w:tcPr>
           <w:p>
@@ -6052,7 +6052,7 @@
         </w:tc>
         <w:tc>
           <w:tcPr>
-            <w:tcW w:type="dxa" w:w="1080"/>
+            <w:tcW w:type="dxa" w:w="1012"/>
             <w:vAlign w:val="center"/>
           </w:tcPr>
           <w:p>
@@ -6072,7 +6072,7 @@
         </w:tc>
         <w:tc>
           <w:tcPr>
-            <w:tcW w:type="dxa" w:w="792"/>
+            <w:tcW w:type="dxa" w:w="742"/>
             <w:vAlign w:val="center"/>
           </w:tcPr>
           <w:p>
@@ -6092,7 +6092,7 @@
         </w:tc>
         <w:tc>
           <w:tcPr>
-            <w:tcW w:type="dxa" w:w="864"/>
+            <w:tcW w:type="dxa" w:w="810"/>
             <w:vAlign w:val="center"/>
           </w:tcPr>
           <w:p>
@@ -6112,7 +6112,7 @@
         </w:tc>
         <w:tc>
           <w:tcPr>
-            <w:tcW w:type="dxa" w:w="648"/>
+            <w:tcW w:type="dxa" w:w="607"/>
             <w:vAlign w:val="center"/>
           </w:tcPr>
           <w:p>
@@ -6132,7 +6132,7 @@
         </w:tc>
         <w:tc>
           <w:tcPr>
-            <w:tcW w:type="dxa" w:w="1440"/>
+            <w:tcW w:type="dxa" w:w="1350"/>
             <w:vAlign w:val="center"/>
           </w:tcPr>
           <w:p>
@@ -6152,7 +6152,7 @@
         </w:tc>
         <w:tc>
           <w:tcPr>
-            <w:tcW w:type="dxa" w:w="936"/>
+            <w:tcW w:type="dxa" w:w="877"/>
             <w:vAlign w:val="center"/>
           </w:tcPr>
           <w:p>
@@ -6172,7 +6172,7 @@
         </w:tc>
         <w:tc>
           <w:tcPr>
-            <w:tcW w:type="dxa" w:w="936"/>
+            <w:tcW w:type="dxa" w:w="877"/>
             <w:vAlign w:val="center"/>
           </w:tcPr>
           <w:p>
@@ -6197,7 +6197,7 @@
         </w:trPr>
         <w:tc>
           <w:tcPr>
-            <w:tcW w:type="dxa" w:w="1901"/>
+            <w:tcW w:type="dxa" w:w="1782"/>
             <w:vAlign w:val="center"/>
           </w:tcPr>
           <w:p>
@@ -6217,7 +6217,7 @@
         </w:tc>
         <w:tc>
           <w:tcPr>
-            <w:tcW w:type="dxa" w:w="1037"/>
+            <w:tcW w:type="dxa" w:w="972"/>
             <w:vAlign w:val="center"/>
           </w:tcPr>
           <w:p>
@@ -6237,7 +6237,7 @@
         </w:tc>
         <w:tc>
           <w:tcPr>
-            <w:tcW w:type="dxa" w:w="1080"/>
+            <w:tcW w:type="dxa" w:w="1012"/>
             <w:vAlign w:val="center"/>
           </w:tcPr>
           <w:p>
@@ -6257,7 +6257,7 @@
         </w:tc>
         <w:tc>
           <w:tcPr>
-            <w:tcW w:type="dxa" w:w="792"/>
+            <w:tcW w:type="dxa" w:w="742"/>
             <w:vAlign w:val="center"/>
           </w:tcPr>
           <w:p>
@@ -6277,7 +6277,7 @@
         </w:tc>
         <w:tc>
           <w:tcPr>
-            <w:tcW w:type="dxa" w:w="864"/>
+            <w:tcW w:type="dxa" w:w="810"/>
             <w:vAlign w:val="center"/>
           </w:tcPr>
           <w:p>
@@ -6297,7 +6297,7 @@
         </w:tc>
         <w:tc>
           <w:tcPr>
-            <w:tcW w:type="dxa" w:w="648"/>
+            <w:tcW w:type="dxa" w:w="607"/>
             <w:vAlign w:val="center"/>
           </w:tcPr>
           <w:p>
@@ -6317,7 +6317,7 @@
         </w:tc>
         <w:tc>
           <w:tcPr>
-            <w:tcW w:type="dxa" w:w="1440"/>
+            <w:tcW w:type="dxa" w:w="1350"/>
             <w:vAlign w:val="center"/>
           </w:tcPr>
           <w:p>
@@ -6337,7 +6337,7 @@
         </w:tc>
         <w:tc>
           <w:tcPr>
-            <w:tcW w:type="dxa" w:w="936"/>
+            <w:tcW w:type="dxa" w:w="877"/>
             <w:vAlign w:val="center"/>
           </w:tcPr>
           <w:p>
@@ -6357,7 +6357,7 @@
         </w:tc>
         <w:tc>
           <w:tcPr>
-            <w:tcW w:type="dxa" w:w="936"/>
+            <w:tcW w:type="dxa" w:w="877"/>
             <w:vAlign w:val="center"/>
           </w:tcPr>
           <w:p>
@@ -6388,12 +6388,12 @@
     </w:p>
     <w:p>
       <w:r>
-        <w:t>Dos observaciones atraviesan la tabla. Primera: recall y conteo medio se separan porque las vistas amplias contienen más instancias —el Gorillapod 0,5x tiene la mayor media de visibles por foto (5,27) y recupera la mayor media de objetos (2,48)—, pero su recall relativo (47,1%) queda por debajo del del arnés de pecho 1x (52,4%); el recall aislado premia encuadres estrechos que ocultan objetos difíciles, por eso siempre se acompaña de la media de visibles. Segunda: la caída entre AP50 (60,5%) y AP50-95 (42,2%) indica que las cajas correctas son a menudo imprecisas, consecuencia esperada del redimensionamiento a 448 × 448; para la tarea del prototipo (nombrar el objeto y ubicarlo en izquierda/centro/derecha) la soltura geométrica exigida por AP50-95 es secundaria.</w:t>
+        <w:t>Dos observaciones atraviesan la tabla. Primera: recall y conteo medio se separan porque las vistas amplias contienen más instancias —el Gorillapod 0,5x tiene la mayor media de visibles por foto (5,27) y recupera la mayor media de objetos (2,48)—, pero su recall relativo (47,1%) queda por debajo del del arnés de pecho 1x (52,4%); el encuadre cambia el denominador y la dificultad de los objetos, por lo que se informa cobertura junto con recall. Segunda: la caída entre AP50 (60,5%) y AP50-95 (42,2%) indica que las cajas correctas son a menudo imprecisas, sin que este experimento aísle la causa de esa diferencia. El efecto del ajuste de las cajas sobre la zona anunciada requiere evaluación específica.</w:t>
       </w:r>
     </w:p>
     <w:p>
       <w:r>
-        <w:t>Finalmente, el límite de dos objetos eleva la precisión de la lista por encima del 80 % en todas las configuraciones: anunciar menos objetos mejora la calidad de cada anuncio. Ese intercambio entre cantidad y calidad de lo anunciado es un comportamiento de diseño del prototipo y este experimento no mide la claridad del habla, cuyo desempeño corresponde al módulo de descriptores de audio.</w:t>
+        <w:t>Finalmente, el límite de dos objetos eleva la precisión de la lista por encima del 80 % en todas las configuraciones. La precisión de la lista mide correspondencia con anotaciones y no la calidad perceptiva de cada anuncio. Este experimento no mide la claridad del habla, cuyo desempeño corresponde al módulo de descriptores de audio.</w:t>
       </w:r>
     </w:p>
     <w:p>
@@ -6414,7 +6414,7 @@
     </w:p>
     <w:p>
       <w:r>
-        <w:t>El emparejamiento por escena controla ambiente, objetos y pose entre las seis capturas de cada grupo; es la fortaleza principal del diseño. Las amenazas principales son: (a) la verdad de campo se revisó una única vez por el autor del proyecto sobre un borrador asistido por modelo, sin auditoría de un segundo revisor independiente; (b) el emparejamiento por grupos proviene del orden ascendente de archivo y debe verificarse contra las notas de captura; (c) seleccionar la mejor configuración sobre este mismo conjunto lo convierte en conjunto de selección, sesgando a favor del ganador observado; (d) los remuestreos de grupos pueden compartir habitación entre grupos vecinos, con lo que la varianza queda subestimada; y (e) ninguna comparación se ajusta por comparaciones múltiples.</w:t>
+        <w:t>El emparejamiento por escena aproxima un contexto común entre las seis capturas de cada grupo; es la fortaleza principal del diseño. Las amenazas principales son: (a) la verdad de campo se revisó una única vez por el autor del proyecto sobre un borrador asistido por modelo, sin auditoría de un segundo revisor independiente; (b) el emparejamiento por grupos proviene del orden ascendente de archivo y debe verificarse contra las notas de captura; (c) seleccionar la mejor configuración sobre este mismo conjunto lo convierte en conjunto de selección, sesgando a favor del ganador observado; (d) los remuestreos de grupos pueden compartir habitación entre grupos vecinos, con lo que la varianza queda subestimada; y (e) ninguna comparación se ajusta por comparaciones múltiples.</w:t>
       </w:r>
     </w:p>
     <w:p>
@@ -6440,7 +6440,7 @@
     </w:p>
     <w:p>
       <w:r>
-        <w:t>Las fotografías provienen de un iPhone 12 Pro Max y la inferencia corrió en un perfil de emulador Pixel 8 (Android 17, API 37, x86_64): las latencias reportadas (mediana 246,3 ms por detección y 104,0 ms por decodificación + preprocesamiento) son mediciones de depuración sobre emulador y no extrapolan al teléfono de destino. Las ópticas del lente 0,5x del iPhone no se trasferirán directamente al teléfono Android del prototipo. El muestreo se limita a interiores con iluminación doméstica o diurna y a diez clases COCO; la generalización a exteriores, iluminación nocturna u otras clases queda fuera del alcance de este capítulo.</w:t>
+        <w:t>Las fotografías provienen de un iPhone 12 Pro Max y la inferencia corrió en un perfil de emulador Pixel 8 (Android 17, API 37, x86_64): las latencias reportadas (mediana 246,3 ms por detección y 104,0 ms por decodificación + preprocesamiento) son mediciones de depuración sobre emulador y no extrapolan al teléfono de destino. Las ópticas del lente 0,5x del iPhone no se trasferirán directamente al teléfono Android del prototipo. El muestreo concentra espacios domésticos e institucionales y contiene también vistas de terrazas; se restringe a diez clases COCO. La generalización a otros exteriores, iluminación nocturna u otras clases queda fuera del alcance de este capítulo.</w:t>
       </w:r>
     </w:p>
     <w:p>
@@ -6453,7 +6453,7 @@
     </w:p>
     <w:p>
       <w:r>
-        <w:t>Las distancias del escenario 3 se estiman con el EXIF del iPhone y alturas de referencia por clase: su incertidumbre es proporcional a la altura de la clase (~±30 %), los objetos ocultos se alejan artificialmente y la mezcla de clases confunde profundidad con dificultad. El rango sugerido de ~4 m es una guía operacional del prototipo; de adoptarse como restricción del producto, debe validarse con distancias medidas en escenas nuevas.</w:t>
+        <w:t>Las distancias del escenario 3 se estiman con el EXIF del iPhone y alturas de referencia por clase: su incertidumbre depende de la altura y no fue calibrada con mediciones, los objetos ocultos se alejan artificialmente y la mezcla de clases confunde profundidad con dificultad. El rango sugerido de ~4 m es una observación exploratoria que debe validarse con distancias medidas en escenas nuevas antes de proponer un rango de operación.</w:t>
       </w:r>
     </w:p>
     <w:p>

</xml_diff>